<commit_message>
added code to the final report
</commit_message>
<xml_diff>
--- a/3) exam - third part - optional HPC project/report final - v2/DeLucaLorenzo.docx
+++ b/3) exam - third part - optional HPC project/report final - v2/DeLucaLorenzo.docx
@@ -104,7 +104,7 @@
           <w:r>
             <w:fldChar w:fldCharType="separate"/>
           </w:r>
-          <w:hyperlink w:anchor="_Toc219609053" w:history="1">
+          <w:hyperlink w:anchor="_Toc219649630" w:history="1">
             <w:r>
               <w:rPr>
                 <w:rStyle w:val="Hyperlink"/>
@@ -132,7 +132,7 @@
                 <w:noProof/>
                 <w:webHidden/>
               </w:rPr>
-              <w:instrText xml:space="preserve"> PAGEREF _Toc219609053 \h </w:instrText>
+              <w:instrText xml:space="preserve"> PAGEREF _Toc219649630 \h </w:instrText>
             </w:r>
             <w:r>
               <w:rPr>
@@ -174,14 +174,14 @@
               <w:noProof/>
             </w:rPr>
           </w:pPr>
-          <w:hyperlink w:anchor="_Toc219609054" w:history="1">
+          <w:hyperlink w:anchor="_Toc219649631" w:history="1">
             <w:r>
               <w:rPr>
                 <w:rStyle w:val="Hyperlink"/>
                 <w:noProof/>
                 <w:lang w:val="it-IT"/>
               </w:rPr>
-              <w:t>Analisi di una soluzione parallela MPI e una OMP, problema da risolvere:</w:t>
+              <w:t>Analisi di una soluzione parallela MPI e una OMP, problema da risolvere</w:t>
             </w:r>
             <w:r>
               <w:rPr>
@@ -202,7 +202,7 @@
                 <w:noProof/>
                 <w:webHidden/>
               </w:rPr>
-              <w:instrText xml:space="preserve"> PAGEREF _Toc219609054 \h </w:instrText>
+              <w:instrText xml:space="preserve"> PAGEREF _Toc219649631 \h </w:instrText>
             </w:r>
             <w:r>
               <w:rPr>
@@ -244,7 +244,7 @@
               <w:noProof/>
             </w:rPr>
           </w:pPr>
-          <w:hyperlink w:anchor="_Toc219609055" w:history="1">
+          <w:hyperlink w:anchor="_Toc219649632" w:history="1">
             <w:r>
               <w:rPr>
                 <w:rStyle w:val="Hyperlink"/>
@@ -272,7 +272,7 @@
                 <w:noProof/>
                 <w:webHidden/>
               </w:rPr>
-              <w:instrText xml:space="preserve"> PAGEREF _Toc219609055 \h </w:instrText>
+              <w:instrText xml:space="preserve"> PAGEREF _Toc219649632 \h </w:instrText>
             </w:r>
             <w:r>
               <w:rPr>
@@ -314,7 +314,7 @@
               <w:noProof/>
             </w:rPr>
           </w:pPr>
-          <w:hyperlink w:anchor="_Toc219609056" w:history="1">
+          <w:hyperlink w:anchor="_Toc219649633" w:history="1">
             <w:r>
               <w:rPr>
                 <w:rStyle w:val="Hyperlink"/>
@@ -342,7 +342,7 @@
                 <w:noProof/>
                 <w:webHidden/>
               </w:rPr>
-              <w:instrText xml:space="preserve"> PAGEREF _Toc219609056 \h </w:instrText>
+              <w:instrText xml:space="preserve"> PAGEREF _Toc219649633 \h </w:instrText>
             </w:r>
             <w:r>
               <w:rPr>
@@ -384,7 +384,7 @@
               <w:noProof/>
             </w:rPr>
           </w:pPr>
-          <w:hyperlink w:anchor="_Toc219609057" w:history="1">
+          <w:hyperlink w:anchor="_Toc219649634" w:history="1">
             <w:r>
               <w:rPr>
                 <w:rStyle w:val="Hyperlink"/>
@@ -412,7 +412,7 @@
                 <w:noProof/>
                 <w:webHidden/>
               </w:rPr>
-              <w:instrText xml:space="preserve"> PAGEREF _Toc219609057 \h </w:instrText>
+              <w:instrText xml:space="preserve"> PAGEREF _Toc219649634 \h </w:instrText>
             </w:r>
             <w:r>
               <w:rPr>
@@ -454,7 +454,7 @@
               <w:noProof/>
             </w:rPr>
           </w:pPr>
-          <w:hyperlink w:anchor="_Toc219609058" w:history="1">
+          <w:hyperlink w:anchor="_Toc219649635" w:history="1">
             <w:r>
               <w:rPr>
                 <w:rStyle w:val="Hyperlink"/>
@@ -482,7 +482,7 @@
                 <w:noProof/>
                 <w:webHidden/>
               </w:rPr>
-              <w:instrText xml:space="preserve"> PAGEREF _Toc219609058 \h </w:instrText>
+              <w:instrText xml:space="preserve"> PAGEREF _Toc219649635 \h </w:instrText>
             </w:r>
             <w:r>
               <w:rPr>
@@ -524,7 +524,7 @@
               <w:noProof/>
             </w:rPr>
           </w:pPr>
-          <w:hyperlink w:anchor="_Toc219609059" w:history="1">
+          <w:hyperlink w:anchor="_Toc219649636" w:history="1">
             <w:r>
               <w:rPr>
                 <w:rStyle w:val="Hyperlink"/>
@@ -552,7 +552,7 @@
                 <w:noProof/>
                 <w:webHidden/>
               </w:rPr>
-              <w:instrText xml:space="preserve"> PAGEREF _Toc219609059 \h </w:instrText>
+              <w:instrText xml:space="preserve"> PAGEREF _Toc219649636 \h </w:instrText>
             </w:r>
             <w:r>
               <w:rPr>
@@ -594,7 +594,7 @@
               <w:noProof/>
             </w:rPr>
           </w:pPr>
-          <w:hyperlink w:anchor="_Toc219609060" w:history="1">
+          <w:hyperlink w:anchor="_Toc219649637" w:history="1">
             <w:r>
               <w:rPr>
                 <w:rStyle w:val="Hyperlink"/>
@@ -622,7 +622,7 @@
                 <w:noProof/>
                 <w:webHidden/>
               </w:rPr>
-              <w:instrText xml:space="preserve"> PAGEREF _Toc219609060 \h </w:instrText>
+              <w:instrText xml:space="preserve"> PAGEREF _Toc219649637 \h </w:instrText>
             </w:r>
             <w:r>
               <w:rPr>
@@ -664,7 +664,7 @@
               <w:noProof/>
             </w:rPr>
           </w:pPr>
-          <w:hyperlink w:anchor="_Toc219609061" w:history="1">
+          <w:hyperlink w:anchor="_Toc219649638" w:history="1">
             <w:r>
               <w:rPr>
                 <w:rStyle w:val="Hyperlink"/>
@@ -692,7 +692,7 @@
                 <w:noProof/>
                 <w:webHidden/>
               </w:rPr>
-              <w:instrText xml:space="preserve"> PAGEREF _Toc219609061 \h </w:instrText>
+              <w:instrText xml:space="preserve"> PAGEREF _Toc219649638 \h </w:instrText>
             </w:r>
             <w:r>
               <w:rPr>
@@ -734,7 +734,7 @@
               <w:noProof/>
             </w:rPr>
           </w:pPr>
-          <w:hyperlink w:anchor="_Toc219609062" w:history="1">
+          <w:hyperlink w:anchor="_Toc219649639" w:history="1">
             <w:r>
               <w:rPr>
                 <w:rStyle w:val="Hyperlink"/>
@@ -762,7 +762,7 @@
                 <w:noProof/>
                 <w:webHidden/>
               </w:rPr>
-              <w:instrText xml:space="preserve"> PAGEREF _Toc219609062 \h </w:instrText>
+              <w:instrText xml:space="preserve"> PAGEREF _Toc219649639 \h </w:instrText>
             </w:r>
             <w:r>
               <w:rPr>
@@ -804,7 +804,7 @@
               <w:noProof/>
             </w:rPr>
           </w:pPr>
-          <w:hyperlink w:anchor="_Toc219609063" w:history="1">
+          <w:hyperlink w:anchor="_Toc219649640" w:history="1">
             <w:r>
               <w:rPr>
                 <w:rStyle w:val="Hyperlink"/>
@@ -832,7 +832,7 @@
                 <w:noProof/>
                 <w:webHidden/>
               </w:rPr>
-              <w:instrText xml:space="preserve"> PAGEREF _Toc219609063 \h </w:instrText>
+              <w:instrText xml:space="preserve"> PAGEREF _Toc219649640 \h </w:instrText>
             </w:r>
             <w:r>
               <w:rPr>
@@ -874,7 +874,7 @@
               <w:noProof/>
             </w:rPr>
           </w:pPr>
-          <w:hyperlink w:anchor="_Toc219609064" w:history="1">
+          <w:hyperlink w:anchor="_Toc219649641" w:history="1">
             <w:r>
               <w:rPr>
                 <w:rStyle w:val="Hyperlink"/>
@@ -902,7 +902,7 @@
                 <w:noProof/>
                 <w:webHidden/>
               </w:rPr>
-              <w:instrText xml:space="preserve"> PAGEREF _Toc219609064 \h </w:instrText>
+              <w:instrText xml:space="preserve"> PAGEREF _Toc219649641 \h </w:instrText>
             </w:r>
             <w:r>
               <w:rPr>
@@ -944,7 +944,7 @@
               <w:noProof/>
             </w:rPr>
           </w:pPr>
-          <w:hyperlink w:anchor="_Toc219609065" w:history="1">
+          <w:hyperlink w:anchor="_Toc219649642" w:history="1">
             <w:r>
               <w:rPr>
                 <w:rStyle w:val="Hyperlink"/>
@@ -972,7 +972,7 @@
                 <w:noProof/>
                 <w:webHidden/>
               </w:rPr>
-              <w:instrText xml:space="preserve"> PAGEREF _Toc219609065 \h </w:instrText>
+              <w:instrText xml:space="preserve"> PAGEREF _Toc219649642 \h </w:instrText>
             </w:r>
             <w:r>
               <w:rPr>
@@ -1014,7 +1014,7 @@
               <w:noProof/>
             </w:rPr>
           </w:pPr>
-          <w:hyperlink w:anchor="_Toc219609066" w:history="1">
+          <w:hyperlink w:anchor="_Toc219649643" w:history="1">
             <w:r>
               <w:rPr>
                 <w:rStyle w:val="Hyperlink"/>
@@ -1042,7 +1042,7 @@
                 <w:noProof/>
                 <w:webHidden/>
               </w:rPr>
-              <w:instrText xml:space="preserve"> PAGEREF _Toc219609066 \h </w:instrText>
+              <w:instrText xml:space="preserve"> PAGEREF _Toc219649643 \h </w:instrText>
             </w:r>
             <w:r>
               <w:rPr>
@@ -1084,7 +1084,7 @@
               <w:noProof/>
             </w:rPr>
           </w:pPr>
-          <w:hyperlink w:anchor="_Toc219609067" w:history="1">
+          <w:hyperlink w:anchor="_Toc219649644" w:history="1">
             <w:r>
               <w:rPr>
                 <w:rStyle w:val="Hyperlink"/>
@@ -1112,7 +1112,7 @@
                 <w:noProof/>
                 <w:webHidden/>
               </w:rPr>
-              <w:instrText xml:space="preserve"> PAGEREF _Toc219609067 \h </w:instrText>
+              <w:instrText xml:space="preserve"> PAGEREF _Toc219649644 \h </w:instrText>
             </w:r>
             <w:r>
               <w:rPr>
@@ -1154,7 +1154,7 @@
               <w:noProof/>
             </w:rPr>
           </w:pPr>
-          <w:hyperlink w:anchor="_Toc219609068" w:history="1">
+          <w:hyperlink w:anchor="_Toc219649645" w:history="1">
             <w:r>
               <w:rPr>
                 <w:rStyle w:val="Hyperlink"/>
@@ -1182,7 +1182,7 @@
                 <w:noProof/>
                 <w:webHidden/>
               </w:rPr>
-              <w:instrText xml:space="preserve"> PAGEREF _Toc219609068 \h </w:instrText>
+              <w:instrText xml:space="preserve"> PAGEREF _Toc219649645 \h </w:instrText>
             </w:r>
             <w:r>
               <w:rPr>
@@ -1224,7 +1224,7 @@
               <w:noProof/>
             </w:rPr>
           </w:pPr>
-          <w:hyperlink w:anchor="_Toc219609069" w:history="1">
+          <w:hyperlink w:anchor="_Toc219649646" w:history="1">
             <w:r>
               <w:rPr>
                 <w:rStyle w:val="Hyperlink"/>
@@ -1252,7 +1252,7 @@
                 <w:noProof/>
                 <w:webHidden/>
               </w:rPr>
-              <w:instrText xml:space="preserve"> PAGEREF _Toc219609069 \h </w:instrText>
+              <w:instrText xml:space="preserve"> PAGEREF _Toc219649646 \h </w:instrText>
             </w:r>
             <w:r>
               <w:rPr>
@@ -1294,7 +1294,7 @@
               <w:noProof/>
             </w:rPr>
           </w:pPr>
-          <w:hyperlink w:anchor="_Toc219609070" w:history="1">
+          <w:hyperlink w:anchor="_Toc219649647" w:history="1">
             <w:r>
               <w:rPr>
                 <w:rStyle w:val="Hyperlink"/>
@@ -1322,7 +1322,7 @@
                 <w:noProof/>
                 <w:webHidden/>
               </w:rPr>
-              <w:instrText xml:space="preserve"> PAGEREF _Toc219609070 \h </w:instrText>
+              <w:instrText xml:space="preserve"> PAGEREF _Toc219649647 \h </w:instrText>
             </w:r>
             <w:r>
               <w:rPr>
@@ -1364,7 +1364,7 @@
               <w:noProof/>
             </w:rPr>
           </w:pPr>
-          <w:hyperlink w:anchor="_Toc219609071" w:history="1">
+          <w:hyperlink w:anchor="_Toc219649648" w:history="1">
             <w:r>
               <w:rPr>
                 <w:rStyle w:val="Hyperlink"/>
@@ -1392,7 +1392,7 @@
                 <w:noProof/>
                 <w:webHidden/>
               </w:rPr>
-              <w:instrText xml:space="preserve"> PAGEREF _Toc219609071 \h </w:instrText>
+              <w:instrText xml:space="preserve"> PAGEREF _Toc219649648 \h </w:instrText>
             </w:r>
             <w:r>
               <w:rPr>
@@ -1434,7 +1434,7 @@
               <w:noProof/>
             </w:rPr>
           </w:pPr>
-          <w:hyperlink w:anchor="_Toc219609072" w:history="1">
+          <w:hyperlink w:anchor="_Toc219649649" w:history="1">
             <w:r>
               <w:rPr>
                 <w:rStyle w:val="Hyperlink"/>
@@ -1462,7 +1462,7 @@
                 <w:noProof/>
                 <w:webHidden/>
               </w:rPr>
-              <w:instrText xml:space="preserve"> PAGEREF _Toc219609072 \h </w:instrText>
+              <w:instrText xml:space="preserve"> PAGEREF _Toc219649649 \h </w:instrText>
             </w:r>
             <w:r>
               <w:rPr>
@@ -1504,7 +1504,7 @@
               <w:noProof/>
             </w:rPr>
           </w:pPr>
-          <w:hyperlink w:anchor="_Toc219609073" w:history="1">
+          <w:hyperlink w:anchor="_Toc219649650" w:history="1">
             <w:r>
               <w:rPr>
                 <w:rStyle w:val="Hyperlink"/>
@@ -1532,7 +1532,7 @@
                 <w:noProof/>
                 <w:webHidden/>
               </w:rPr>
-              <w:instrText xml:space="preserve"> PAGEREF _Toc219609073 \h </w:instrText>
+              <w:instrText xml:space="preserve"> PAGEREF _Toc219649650 \h </w:instrText>
             </w:r>
             <w:r>
               <w:rPr>
@@ -1574,14 +1574,14 @@
               <w:noProof/>
             </w:rPr>
           </w:pPr>
-          <w:hyperlink w:anchor="_Toc219609074" w:history="1">
+          <w:hyperlink w:anchor="_Toc219649651" w:history="1">
             <w:r>
               <w:rPr>
                 <w:rStyle w:val="Hyperlink"/>
                 <w:noProof/>
                 <w:lang w:val="it-IT"/>
               </w:rPr>
-              <w:t>Grafi di sintesi</w:t>
+              <w:t>Grafici di sintesi</w:t>
             </w:r>
             <w:r>
               <w:rPr>
@@ -1602,7 +1602,7 @@
                 <w:noProof/>
                 <w:webHidden/>
               </w:rPr>
-              <w:instrText xml:space="preserve"> PAGEREF _Toc219609074 \h </w:instrText>
+              <w:instrText xml:space="preserve"> PAGEREF _Toc219649651 \h </w:instrText>
             </w:r>
             <w:r>
               <w:rPr>
@@ -1644,7 +1644,7 @@
               <w:noProof/>
             </w:rPr>
           </w:pPr>
-          <w:hyperlink w:anchor="_Toc219609075" w:history="1">
+          <w:hyperlink w:anchor="_Toc219649652" w:history="1">
             <w:r>
               <w:rPr>
                 <w:rStyle w:val="Hyperlink"/>
@@ -1672,7 +1672,7 @@
                 <w:noProof/>
                 <w:webHidden/>
               </w:rPr>
-              <w:instrText xml:space="preserve"> PAGEREF _Toc219609075 \h </w:instrText>
+              <w:instrText xml:space="preserve"> PAGEREF _Toc219649652 \h </w:instrText>
             </w:r>
             <w:r>
               <w:rPr>
@@ -1714,7 +1714,7 @@
               <w:noProof/>
             </w:rPr>
           </w:pPr>
-          <w:hyperlink w:anchor="_Toc219609076" w:history="1">
+          <w:hyperlink w:anchor="_Toc219649653" w:history="1">
             <w:r>
               <w:rPr>
                 <w:rStyle w:val="Hyperlink"/>
@@ -1742,7 +1742,7 @@
                 <w:noProof/>
                 <w:webHidden/>
               </w:rPr>
-              <w:instrText xml:space="preserve"> PAGEREF _Toc219609076 \h </w:instrText>
+              <w:instrText xml:space="preserve"> PAGEREF _Toc219649653 \h </w:instrText>
             </w:r>
             <w:r>
               <w:rPr>
@@ -1762,7 +1762,7 @@
                 <w:noProof/>
                 <w:webHidden/>
               </w:rPr>
-              <w:t>13</w:t>
+              <w:t>12</w:t>
             </w:r>
             <w:r>
               <w:rPr>
@@ -1784,7 +1784,7 @@
               <w:noProof/>
             </w:rPr>
           </w:pPr>
-          <w:hyperlink w:anchor="_Toc219609077" w:history="1">
+          <w:hyperlink w:anchor="_Toc219649654" w:history="1">
             <w:r>
               <w:rPr>
                 <w:rStyle w:val="Hyperlink"/>
@@ -1812,7 +1812,7 @@
                 <w:noProof/>
                 <w:webHidden/>
               </w:rPr>
-              <w:instrText xml:space="preserve"> PAGEREF _Toc219609077 \h </w:instrText>
+              <w:instrText xml:space="preserve"> PAGEREF _Toc219649654 \h </w:instrText>
             </w:r>
             <w:r>
               <w:rPr>
@@ -1854,7 +1854,7 @@
               <w:noProof/>
             </w:rPr>
           </w:pPr>
-          <w:hyperlink w:anchor="_Toc219609078" w:history="1">
+          <w:hyperlink w:anchor="_Toc219649655" w:history="1">
             <w:r>
               <w:rPr>
                 <w:rStyle w:val="Hyperlink"/>
@@ -1882,7 +1882,7 @@
                 <w:noProof/>
                 <w:webHidden/>
               </w:rPr>
-              <w:instrText xml:space="preserve"> PAGEREF _Toc219609078 \h </w:instrText>
+              <w:instrText xml:space="preserve"> PAGEREF _Toc219649655 \h </w:instrText>
             </w:r>
             <w:r>
               <w:rPr>
@@ -1902,7 +1902,7 @@
                 <w:noProof/>
                 <w:webHidden/>
               </w:rPr>
-              <w:t>17</w:t>
+              <w:t>16</w:t>
             </w:r>
             <w:r>
               <w:rPr>
@@ -1945,7 +1945,7 @@
           <w:lang w:val="it-IT"/>
         </w:rPr>
       </w:pPr>
-      <w:bookmarkStart w:id="0" w:name="_Toc219609053"/>
+      <w:bookmarkStart w:id="0" w:name="_Toc219649630"/>
       <w:r>
         <w:rPr>
           <w:lang w:val="it-IT"/>
@@ -1965,7 +1965,7 @@
           <w:lang w:val="it-IT"/>
         </w:rPr>
       </w:pPr>
-      <w:bookmarkStart w:id="1" w:name="_Toc219609054"/>
+      <w:bookmarkStart w:id="1" w:name="_Toc219649631"/>
       <w:r>
         <w:rPr>
           <w:rStyle w:val="Heading2Char"/>
@@ -1985,16 +1985,9 @@
           <w:rStyle w:val="Heading2Char"/>
           <w:lang w:val="it-IT"/>
         </w:rPr>
-        <w:t xml:space="preserve"> da risolvere:</w:t>
+        <w:t xml:space="preserve"> da risolvere</w:t>
       </w:r>
       <w:bookmarkEnd w:id="1"/>
-      <w:r>
-        <w:rPr>
-          <w:rStyle w:val="Heading2Char"/>
-          <w:lang w:val="it-IT"/>
-        </w:rPr>
-        <w:t xml:space="preserve"> </w:t>
-      </w:r>
     </w:p>
     <w:p>
       <w:pPr>
@@ -2085,21 +2078,7 @@
         <w:rPr>
           <w:lang w:val="it-IT"/>
         </w:rPr>
-        <w:t xml:space="preserve">per ogni </w:t>
-      </w:r>
-      <w:proofErr w:type="spellStart"/>
-      <w:r>
-        <w:rPr>
-          <w:lang w:val="it-IT"/>
-        </w:rPr>
-        <w:t>aij</w:t>
-      </w:r>
-      <w:proofErr w:type="spellEnd"/>
-      <w:r>
-        <w:rPr>
-          <w:lang w:val="it-IT"/>
-        </w:rPr>
-        <w:t xml:space="preserve"> </w:t>
+        <w:t xml:space="preserve">per ogni aij </w:t>
       </w:r>
       <w:r>
         <w:rPr>
@@ -2374,21 +2353,7 @@
         <w:rPr>
           <w:lang w:val="it-IT"/>
         </w:rPr>
-        <w:t xml:space="preserve">• per ogni </w:t>
-      </w:r>
-      <w:proofErr w:type="spellStart"/>
-      <w:r>
-        <w:rPr>
-          <w:lang w:val="it-IT"/>
-        </w:rPr>
-        <w:t>aij</w:t>
-      </w:r>
-      <w:proofErr w:type="spellEnd"/>
-      <w:r>
-        <w:rPr>
-          <w:lang w:val="it-IT"/>
-        </w:rPr>
-        <w:t xml:space="preserve"> </w:t>
+        <w:t xml:space="preserve">• per ogni aij </w:t>
       </w:r>
       <w:r>
         <w:rPr>
@@ -2557,21 +2522,7 @@
         <w:rPr>
           <w:lang w:val="it-IT"/>
         </w:rPr>
-        <w:t xml:space="preserve">• Sia </w:t>
-      </w:r>
-      <w:proofErr w:type="spellStart"/>
-      <w:r>
-        <w:rPr>
-          <w:lang w:val="it-IT"/>
-        </w:rPr>
-        <w:t>mij</w:t>
-      </w:r>
-      <w:proofErr w:type="spellEnd"/>
-      <w:r>
-        <w:rPr>
-          <w:lang w:val="it-IT"/>
-        </w:rPr>
-        <w:t xml:space="preserve"> la media aritmetica dei valori appartenenti all’intorno Aij:</w:t>
+        <w:t>• Sia mij la media aritmetica dei valori appartenenti all’intorno Aij:</w:t>
       </w:r>
     </w:p>
     <w:p>
@@ -2584,21 +2535,7 @@
         <w:rPr>
           <w:lang w:val="it-IT"/>
         </w:rPr>
-        <w:t xml:space="preserve">Ogni </w:t>
-      </w:r>
-      <w:proofErr w:type="spellStart"/>
-      <w:r>
-        <w:rPr>
-          <w:lang w:val="it-IT"/>
-        </w:rPr>
-        <w:t>tij</w:t>
-      </w:r>
-      <w:proofErr w:type="spellEnd"/>
-      <w:r>
-        <w:rPr>
-          <w:lang w:val="it-IT"/>
-        </w:rPr>
-        <w:t xml:space="preserve"> </w:t>
+        <w:t xml:space="preserve">Ogni tij </w:t>
       </w:r>
       <w:r>
         <w:rPr>
@@ -2780,49 +2717,7 @@
         <w:rPr>
           <w:lang w:val="it-IT"/>
         </w:rPr>
-        <w:t xml:space="preserve">▪ se </w:t>
-      </w:r>
-      <w:proofErr w:type="spellStart"/>
-      <w:r>
-        <w:rPr>
-          <w:lang w:val="it-IT"/>
-        </w:rPr>
-        <w:t>aij</w:t>
-      </w:r>
-      <w:proofErr w:type="spellEnd"/>
-      <w:r>
-        <w:rPr>
-          <w:lang w:val="it-IT"/>
-        </w:rPr>
-        <w:t xml:space="preserve"> &gt;</w:t>
-      </w:r>
-      <w:proofErr w:type="spellStart"/>
-      <w:r>
-        <w:rPr>
-          <w:lang w:val="it-IT"/>
-        </w:rPr>
-        <w:t>mij</w:t>
-      </w:r>
-      <w:proofErr w:type="spellEnd"/>
-      <w:r>
-        <w:rPr>
-          <w:lang w:val="it-IT"/>
-        </w:rPr>
-        <w:t xml:space="preserve"> → </w:t>
-      </w:r>
-      <w:proofErr w:type="spellStart"/>
-      <w:r>
-        <w:rPr>
-          <w:lang w:val="it-IT"/>
-        </w:rPr>
-        <w:t>tij</w:t>
-      </w:r>
-      <w:proofErr w:type="spellEnd"/>
-      <w:r>
-        <w:rPr>
-          <w:lang w:val="it-IT"/>
-        </w:rPr>
-        <w:t xml:space="preserve"> =1</w:t>
+        <w:t>▪ se aij &gt;mij → tij =1</w:t>
       </w:r>
     </w:p>
     <w:p>
@@ -2835,21 +2730,7 @@
         <w:rPr>
           <w:lang w:val="it-IT"/>
         </w:rPr>
-        <w:t xml:space="preserve">▪ se </w:t>
-      </w:r>
-      <w:proofErr w:type="spellStart"/>
-      <w:r>
-        <w:rPr>
-          <w:lang w:val="it-IT"/>
-        </w:rPr>
-        <w:t>aij</w:t>
-      </w:r>
-      <w:proofErr w:type="spellEnd"/>
-      <w:r>
-        <w:rPr>
-          <w:lang w:val="it-IT"/>
-        </w:rPr>
-        <w:t xml:space="preserve">≤ </w:t>
+        <w:t xml:space="preserve">▪ se aij≤ </w:t>
       </w:r>
       <w:r>
         <w:rPr>
@@ -2862,21 +2743,7 @@
         <w:rPr>
           <w:lang w:val="it-IT"/>
         </w:rPr>
-        <w:t xml:space="preserve"> → </w:t>
-      </w:r>
-      <w:proofErr w:type="spellStart"/>
-      <w:r>
-        <w:rPr>
-          <w:lang w:val="it-IT"/>
-        </w:rPr>
-        <w:t>tij</w:t>
-      </w:r>
-      <w:proofErr w:type="spellEnd"/>
-      <w:r>
-        <w:rPr>
-          <w:lang w:val="it-IT"/>
-        </w:rPr>
-        <w:t xml:space="preserve"> =0</w:t>
+        <w:t xml:space="preserve"> → tij =0</w:t>
       </w:r>
     </w:p>
     <w:p>
@@ -2899,7 +2766,7 @@
           <w:lang w:val="it-IT"/>
         </w:rPr>
       </w:pPr>
-      <w:bookmarkStart w:id="2" w:name="_Toc219609055"/>
+      <w:bookmarkStart w:id="2" w:name="_Toc219649632"/>
       <w:r>
         <w:rPr>
           <w:lang w:val="it-IT"/>
@@ -2949,21 +2816,29 @@
         <w:rPr>
           <w:lang w:val="it-IT"/>
         </w:rPr>
-        <w:t xml:space="preserve">Linux </w:t>
+        <w:t xml:space="preserve">Linux Infiniband Cluster  </w:t>
       </w:r>
-      <w:proofErr w:type="spellStart"/>
+    </w:p>
+    <w:p>
       <w:r>
-        <w:rPr>
-          <w:lang w:val="it-IT"/>
-        </w:rPr>
-        <w:t>Infiniband</w:t>
+        <w:t>OS:  CentOS 8.3</w:t>
       </w:r>
-      <w:proofErr w:type="spellEnd"/>
+    </w:p>
+    <w:p>
       <w:r>
-        <w:rPr>
-          <w:lang w:val="it-IT"/>
-        </w:rPr>
-        <w:t xml:space="preserve"> Cluster  </w:t>
+        <w:t>Nodi</w:t>
+      </w:r>
+      <w:r>
+        <w:t>: 554 compute nodes with 2 x CPU Intel CascadeLake 8260</w:t>
+      </w:r>
+      <w:r>
+        <w:t>(</w:t>
+      </w:r>
+      <w:r>
+        <w:t>24 cores, 2.4 GHz</w:t>
+      </w:r>
+      <w:r>
+        <w:t>)</w:t>
       </w:r>
     </w:p>
     <w:p>
@@ -2976,69 +2851,19 @@
         <w:rPr>
           <w:lang w:val="it-IT"/>
         </w:rPr>
-        <w:t xml:space="preserve">OS: </w:t>
+        <w:t>Ram(nodo): 384GB RAM DDR4</w:t>
       </w:r>
+    </w:p>
+    <w:p>
+      <w:pPr>
+        <w:rPr>
+          <w:lang w:val="it-IT"/>
+        </w:rPr>
+      </w:pPr>
       <w:r>
         <w:rPr>
           <w:lang w:val="it-IT"/>
         </w:rPr>
-        <w:t xml:space="preserve"> </w:t>
-      </w:r>
-      <w:proofErr w:type="spellStart"/>
-      <w:r>
-        <w:rPr>
-          <w:lang w:val="it-IT"/>
-        </w:rPr>
-        <w:t>CentOS</w:t>
-      </w:r>
-      <w:proofErr w:type="spellEnd"/>
-      <w:r>
-        <w:rPr>
-          <w:lang w:val="it-IT"/>
-        </w:rPr>
-        <w:t xml:space="preserve"> 8.3</w:t>
-      </w:r>
-    </w:p>
-    <w:p>
-      <w:r>
-        <w:t>Nodi</w:t>
-      </w:r>
-      <w:r>
-        <w:t xml:space="preserve">: 554 compute nodes with 2 x CPU Intel </w:t>
-      </w:r>
-      <w:proofErr w:type="spellStart"/>
-      <w:r>
-        <w:t>CascadeLake</w:t>
-      </w:r>
-      <w:proofErr w:type="spellEnd"/>
-      <w:r>
-        <w:t xml:space="preserve"> 8260</w:t>
-      </w:r>
-      <w:r>
-        <w:t>(</w:t>
-      </w:r>
-      <w:r>
-        <w:t>24 cores, 2.4 GHz</w:t>
-      </w:r>
-      <w:r>
-        <w:t>)</w:t>
-      </w:r>
-    </w:p>
-    <w:p>
-      <w:r>
-        <w:t>Ram(</w:t>
-      </w:r>
-      <w:proofErr w:type="spellStart"/>
-      <w:r>
-        <w:t>nodo</w:t>
-      </w:r>
-      <w:proofErr w:type="spellEnd"/>
-      <w:r>
-        <w:t>): 384GB RAM DDR4</w:t>
-      </w:r>
-    </w:p>
-    <w:p>
-      <w:r>
         <w:t>Tipi di nodi:</w:t>
       </w:r>
     </w:p>
@@ -3094,49 +2919,7 @@
         <w:rPr>
           <w:lang w:val="it-IT"/>
         </w:rPr>
-        <w:t xml:space="preserve">Rete </w:t>
-      </w:r>
-      <w:proofErr w:type="gramStart"/>
-      <w:r>
-        <w:rPr>
-          <w:lang w:val="it-IT"/>
-        </w:rPr>
-        <w:t>inter-nodo</w:t>
-      </w:r>
-      <w:proofErr w:type="gramEnd"/>
-      <w:r>
-        <w:rPr>
-          <w:lang w:val="it-IT"/>
-        </w:rPr>
-        <w:t xml:space="preserve">: </w:t>
-      </w:r>
-      <w:proofErr w:type="spellStart"/>
-      <w:r>
-        <w:rPr>
-          <w:lang w:val="it-IT"/>
-        </w:rPr>
-        <w:t>Mellanox</w:t>
-      </w:r>
-      <w:proofErr w:type="spellEnd"/>
-      <w:r>
-        <w:rPr>
-          <w:lang w:val="it-IT"/>
-        </w:rPr>
-        <w:t xml:space="preserve"> </w:t>
-      </w:r>
-      <w:proofErr w:type="spellStart"/>
-      <w:r>
-        <w:rPr>
-          <w:lang w:val="it-IT"/>
-        </w:rPr>
-        <w:t>Infiniband</w:t>
-      </w:r>
-      <w:proofErr w:type="spellEnd"/>
-      <w:r>
-        <w:rPr>
-          <w:lang w:val="it-IT"/>
-        </w:rPr>
-        <w:t xml:space="preserve"> HDR100</w:t>
+        <w:t>Rete inter-nodo: Mellanox Infiniband HDR100</w:t>
       </w:r>
     </w:p>
     <w:p>
@@ -3145,19 +2928,11 @@
           <w:lang w:val="it-IT"/>
         </w:rPr>
       </w:pPr>
-      <w:proofErr w:type="spellStart"/>
       <w:r>
         <w:rPr>
           <w:lang w:val="it-IT"/>
         </w:rPr>
-        <w:t>Workload</w:t>
-      </w:r>
-      <w:proofErr w:type="spellEnd"/>
-      <w:r>
-        <w:rPr>
-          <w:lang w:val="it-IT"/>
-        </w:rPr>
-        <w:t xml:space="preserve"> Manager: SLURM 23.11</w:t>
+        <w:t>Workload Manager: SLURM 23.11</w:t>
       </w:r>
     </w:p>
     <w:p>
@@ -3194,7 +2969,7 @@
           <w:lang w:val="it-IT"/>
         </w:rPr>
       </w:pPr>
-      <w:bookmarkStart w:id="3" w:name="_Toc219609056"/>
+      <w:bookmarkStart w:id="3" w:name="_Toc219649633"/>
       <w:r>
         <w:rPr>
           <w:lang w:val="it-IT"/>
@@ -3211,7 +2986,7 @@
           <w:lang w:val="it-IT"/>
         </w:rPr>
       </w:pPr>
-      <w:bookmarkStart w:id="4" w:name="_Toc219609057"/>
+      <w:bookmarkStart w:id="4" w:name="_Toc219649634"/>
       <w:r>
         <w:rPr>
           <w:lang w:val="it-IT"/>
@@ -3267,21 +3042,7 @@
         <w:rPr>
           <w:lang w:val="it-IT"/>
         </w:rPr>
-        <w:t xml:space="preserve">Per fare questo con un susseguirsi di esecuzioni sequenziali del programma pilotate da uno script </w:t>
-      </w:r>
-      <w:proofErr w:type="spellStart"/>
-      <w:r>
-        <w:rPr>
-          <w:lang w:val="it-IT"/>
-        </w:rPr>
-        <w:t>sbatch</w:t>
-      </w:r>
-      <w:proofErr w:type="spellEnd"/>
-      <w:r>
-        <w:rPr>
-          <w:lang w:val="it-IT"/>
-        </w:rPr>
-        <w:t xml:space="preserve"> aumento ad </w:t>
+        <w:t xml:space="preserve">Per fare questo con un susseguirsi di esecuzioni sequenziali del programma pilotate da uno script sbatch aumento ad </w:t>
       </w:r>
       <w:r>
         <w:rPr>
@@ -3323,7 +3084,7 @@
           <w:lang w:val="it-IT"/>
         </w:rPr>
       </w:pPr>
-      <w:bookmarkStart w:id="5" w:name="_Toc219609058"/>
+      <w:bookmarkStart w:id="5" w:name="_Toc219649635"/>
       <w:r>
         <w:rPr>
           <w:lang w:val="it-IT"/>
@@ -5232,14 +4993,13 @@
           <w:lang w:val="it-IT"/>
         </w:rPr>
       </w:pPr>
-      <w:bookmarkStart w:id="6" w:name="_Toc219609059"/>
+      <w:bookmarkStart w:id="6" w:name="_Toc219649636"/>
       <w:r>
         <w:rPr>
           <w:lang w:val="it-IT"/>
         </w:rPr>
         <w:t xml:space="preserve">Scalabilità Strong MPI – </w:t>
       </w:r>
-      <w:proofErr w:type="spellStart"/>
       <w:r>
         <w:rPr>
           <w:lang w:val="it-IT"/>
@@ -5247,7 +5007,6 @@
         <w:t>Speedup</w:t>
       </w:r>
       <w:bookmarkEnd w:id="6"/>
-      <w:proofErr w:type="spellEnd"/>
     </w:p>
     <w:p>
       <w:pPr>
@@ -5288,7 +5047,7 @@
           <w:lang w:val="it-IT"/>
         </w:rPr>
       </w:pPr>
-      <w:bookmarkStart w:id="7" w:name="_Toc219609060"/>
+      <w:bookmarkStart w:id="7" w:name="_Toc219649637"/>
       <w:r>
         <w:rPr>
           <w:lang w:val="it-IT"/>
@@ -5349,27 +5108,13 @@
           <w:lang w:val="it-IT"/>
         </w:rPr>
       </w:pPr>
-      <w:bookmarkStart w:id="8" w:name="_Toc219609061"/>
+      <w:bookmarkStart w:id="8" w:name="_Toc219649638"/>
       <w:r>
         <w:rPr>
           <w:lang w:val="it-IT"/>
         </w:rPr>
         <w:lastRenderedPageBreak/>
-        <w:t xml:space="preserve">Scalabilità </w:t>
-      </w:r>
-      <w:proofErr w:type="spellStart"/>
-      <w:r>
-        <w:rPr>
-          <w:lang w:val="it-IT"/>
-        </w:rPr>
-        <w:t>weak</w:t>
-      </w:r>
-      <w:proofErr w:type="spellEnd"/>
-      <w:r>
-        <w:rPr>
-          <w:lang w:val="it-IT"/>
-        </w:rPr>
-        <w:t xml:space="preserve"> MPI – sistema di test</w:t>
+        <w:t>Scalabilità weak MPI – sistema di test</w:t>
       </w:r>
       <w:bookmarkEnd w:id="8"/>
     </w:p>
@@ -5383,21 +5128,7 @@
         <w:rPr>
           <w:lang w:val="it-IT"/>
         </w:rPr>
-        <w:t xml:space="preserve">Per testare la scalabilità </w:t>
-      </w:r>
-      <w:proofErr w:type="spellStart"/>
-      <w:r>
-        <w:rPr>
-          <w:lang w:val="it-IT"/>
-        </w:rPr>
-        <w:t>weak</w:t>
-      </w:r>
-      <w:proofErr w:type="spellEnd"/>
-      <w:r>
-        <w:rPr>
-          <w:lang w:val="it-IT"/>
-        </w:rPr>
-        <w:t xml:space="preserve"> bisogna aumentare il numero di processi mantenendo costante la dimensione del problema per </w:t>
+        <w:t xml:space="preserve">Per testare la scalabilità weak bisogna aumentare il numero di processi mantenendo costante la dimensione del problema per </w:t>
       </w:r>
       <w:r>
         <w:rPr>
@@ -5421,21 +5152,7 @@
         <w:rPr>
           <w:lang w:val="it-IT"/>
         </w:rPr>
-        <w:t xml:space="preserve"> per nodo costante. Per fare questo con un susseguirsi di esecuzioni sequenziali del programma pilotate da uno script </w:t>
-      </w:r>
-      <w:proofErr w:type="spellStart"/>
-      <w:r>
-        <w:rPr>
-          <w:lang w:val="it-IT"/>
-        </w:rPr>
-        <w:t>sbatch</w:t>
-      </w:r>
-      <w:proofErr w:type="spellEnd"/>
-      <w:r>
-        <w:rPr>
-          <w:lang w:val="it-IT"/>
-        </w:rPr>
-        <w:t xml:space="preserve"> aumento ad </w:t>
+        <w:t xml:space="preserve"> per nodo costante. Per fare questo con un susseguirsi di esecuzioni sequenziali del programma pilotate da uno script sbatch aumento ad </w:t>
       </w:r>
       <w:r>
         <w:rPr>
@@ -5489,21 +5206,19 @@
           <w:lang w:val="it-IT"/>
         </w:rPr>
       </w:pPr>
-      <w:bookmarkStart w:id="9" w:name="_Toc219609062"/>
+      <w:bookmarkStart w:id="9" w:name="_Toc219649639"/>
       <w:r>
         <w:rPr>
           <w:lang w:val="it-IT"/>
         </w:rPr>
         <w:t xml:space="preserve">Scalabilità </w:t>
       </w:r>
-      <w:proofErr w:type="spellStart"/>
       <w:r>
         <w:rPr>
           <w:lang w:val="it-IT"/>
         </w:rPr>
         <w:t>weak</w:t>
       </w:r>
-      <w:proofErr w:type="spellEnd"/>
       <w:r>
         <w:rPr>
           <w:lang w:val="it-IT"/>
@@ -7267,28 +6982,25 @@
           <w:lang w:val="it-IT"/>
         </w:rPr>
       </w:pPr>
-      <w:bookmarkStart w:id="10" w:name="_Toc219609063"/>
+      <w:bookmarkStart w:id="10" w:name="_Toc219649640"/>
       <w:r>
         <w:rPr>
           <w:lang w:val="it-IT"/>
         </w:rPr>
         <w:t xml:space="preserve">Scalabilità </w:t>
       </w:r>
-      <w:proofErr w:type="spellStart"/>
       <w:r>
         <w:rPr>
           <w:lang w:val="it-IT"/>
         </w:rPr>
         <w:t>weak</w:t>
       </w:r>
-      <w:proofErr w:type="spellEnd"/>
       <w:r>
         <w:rPr>
           <w:lang w:val="it-IT"/>
         </w:rPr>
         <w:t xml:space="preserve"> MPI – </w:t>
       </w:r>
-      <w:proofErr w:type="spellStart"/>
       <w:r>
         <w:rPr>
           <w:lang w:val="it-IT"/>
@@ -7302,7 +7014,6 @@
         <w:t>peedup</w:t>
       </w:r>
       <w:bookmarkEnd w:id="10"/>
-      <w:proofErr w:type="spellEnd"/>
     </w:p>
     <w:p>
       <w:pPr>
@@ -7342,27 +7053,13 @@
           <w:lang w:val="it-IT"/>
         </w:rPr>
       </w:pPr>
-      <w:bookmarkStart w:id="11" w:name="_Toc219609064"/>
+      <w:bookmarkStart w:id="11" w:name="_Toc219649641"/>
       <w:r>
         <w:rPr>
           <w:lang w:val="it-IT"/>
         </w:rPr>
         <w:lastRenderedPageBreak/>
-        <w:t xml:space="preserve">Scalabilità </w:t>
-      </w:r>
-      <w:proofErr w:type="spellStart"/>
-      <w:r>
-        <w:rPr>
-          <w:lang w:val="it-IT"/>
-        </w:rPr>
-        <w:t>weak</w:t>
-      </w:r>
-      <w:proofErr w:type="spellEnd"/>
-      <w:r>
-        <w:rPr>
-          <w:lang w:val="it-IT"/>
-        </w:rPr>
-        <w:t xml:space="preserve"> MPI – </w:t>
+        <w:t xml:space="preserve">Scalabilità weak MPI – </w:t>
       </w:r>
       <w:r>
         <w:rPr>
@@ -7429,7 +7126,7 @@
           <w:lang w:val="it-IT"/>
         </w:rPr>
       </w:pPr>
-      <w:bookmarkStart w:id="12" w:name="_Toc219609065"/>
+      <w:bookmarkStart w:id="12" w:name="_Toc219649642"/>
       <w:r>
         <w:rPr>
           <w:lang w:val="it-IT"/>
@@ -7445,7 +7142,7 @@
           <w:lang w:val="it-IT"/>
         </w:rPr>
       </w:pPr>
-      <w:bookmarkStart w:id="13" w:name="_Toc219609066"/>
+      <w:bookmarkStart w:id="13" w:name="_Toc219649643"/>
       <w:r>
         <w:rPr>
           <w:lang w:val="it-IT"/>
@@ -7495,34 +7192,13 @@
         <w:rPr>
           <w:lang w:val="it-IT"/>
         </w:rPr>
-        <w:t xml:space="preserve"> in </w:t>
-      </w:r>
-      <w:proofErr w:type="spellStart"/>
-      <w:r>
-        <w:rPr>
-          <w:lang w:val="it-IT"/>
-        </w:rPr>
-        <w:t>OpenMP</w:t>
-      </w:r>
-      <w:proofErr w:type="spellEnd"/>
-      <w:r>
-        <w:rPr>
-          <w:lang w:val="it-IT"/>
-        </w:rPr>
-        <w:t>(</w:t>
+        <w:t xml:space="preserve"> in OpenMP(</w:t>
       </w:r>
       <w:r>
         <w:rPr>
           <w:lang w:val="it-IT"/>
         </w:rPr>
-        <w:t xml:space="preserve">Open </w:t>
-      </w:r>
-      <w:proofErr w:type="spellStart"/>
-      <w:r>
-        <w:rPr>
-          <w:lang w:val="it-IT"/>
-        </w:rPr>
-        <w:t>Multi</w:t>
+        <w:t>Open Multi</w:t>
       </w:r>
       <w:r>
         <w:rPr>
@@ -7536,7 +7212,6 @@
         </w:rPr>
         <w:t>rocessing</w:t>
       </w:r>
-      <w:proofErr w:type="spellEnd"/>
       <w:r>
         <w:rPr>
           <w:lang w:val="it-IT"/>
@@ -7549,51 +7224,25 @@
         </w:rPr>
         <w:t xml:space="preserve"> bisogna aumentare il numero di </w:t>
       </w:r>
-      <w:proofErr w:type="spellStart"/>
       <w:r>
         <w:rPr>
           <w:lang w:val="it-IT"/>
         </w:rPr>
         <w:t>thread</w:t>
       </w:r>
-      <w:proofErr w:type="spellEnd"/>
       <w:r>
         <w:rPr>
           <w:lang w:val="it-IT"/>
         </w:rPr>
-        <w:t xml:space="preserve"> mantenendo costante la dimensione del problema. Per fare questo con un susseguirsi di esecuzioni sequenziali del programma pilotate da uno script </w:t>
+        <w:t xml:space="preserve"> mantenendo costante la dimensione del problema. Per fare questo con un susseguirsi di esecuzioni sequenziali del programma pilotate da uno script sbatch aumento ad ogni esecuzione il numero di </w:t>
       </w:r>
-      <w:proofErr w:type="spellStart"/>
-      <w:r>
-        <w:rPr>
-          <w:lang w:val="it-IT"/>
-        </w:rPr>
-        <w:t>sbatch</w:t>
-      </w:r>
-      <w:proofErr w:type="spellEnd"/>
-      <w:r>
-        <w:rPr>
-          <w:lang w:val="it-IT"/>
-        </w:rPr>
-        <w:t xml:space="preserve"> aumento ad ogni esecuzione il numero di </w:t>
-      </w:r>
-      <w:proofErr w:type="spellStart"/>
       <w:r>
         <w:rPr>
           <w:b/>
           <w:bCs/>
           <w:lang w:val="it-IT"/>
         </w:rPr>
-        <w:t>thread</w:t>
-      </w:r>
-      <w:proofErr w:type="spellEnd"/>
-      <w:r>
-        <w:rPr>
-          <w:b/>
-          <w:bCs/>
-          <w:lang w:val="it-IT"/>
-        </w:rPr>
-        <w:t xml:space="preserve"> nel nodo</w:t>
+        <w:t>thread nel nodo</w:t>
       </w:r>
       <w:r>
         <w:rPr>
@@ -7609,7 +7258,7 @@
           <w:lang w:val="it-IT"/>
         </w:rPr>
       </w:pPr>
-      <w:bookmarkStart w:id="14" w:name="_Toc219609067"/>
+      <w:bookmarkStart w:id="14" w:name="_Toc219649644"/>
       <w:r>
         <w:rPr>
           <w:lang w:val="it-IT"/>
@@ -9386,14 +9035,13 @@
           <w:lang w:val="it-IT"/>
         </w:rPr>
       </w:pPr>
-      <w:bookmarkStart w:id="15" w:name="_Toc219609068"/>
+      <w:bookmarkStart w:id="15" w:name="_Toc219649645"/>
       <w:r>
         <w:rPr>
           <w:lang w:val="it-IT"/>
         </w:rPr>
         <w:t xml:space="preserve">Scalabilità strong OMP – </w:t>
       </w:r>
-      <w:proofErr w:type="spellStart"/>
       <w:r>
         <w:rPr>
           <w:lang w:val="it-IT"/>
@@ -9401,7 +9049,6 @@
         <w:t>Speedup</w:t>
       </w:r>
       <w:bookmarkEnd w:id="15"/>
-      <w:proofErr w:type="spellEnd"/>
     </w:p>
     <w:p>
       <w:pPr>
@@ -9441,7 +9088,7 @@
           <w:lang w:val="it-IT"/>
         </w:rPr>
       </w:pPr>
-      <w:bookmarkStart w:id="16" w:name="_Toc219609069"/>
+      <w:bookmarkStart w:id="16" w:name="_Toc219649646"/>
       <w:r>
         <w:rPr>
           <w:lang w:val="it-IT"/>
@@ -9502,27 +9149,13 @@
           <w:lang w:val="it-IT"/>
         </w:rPr>
       </w:pPr>
-      <w:bookmarkStart w:id="17" w:name="_Toc219609070"/>
+      <w:bookmarkStart w:id="17" w:name="_Toc219649647"/>
       <w:r>
         <w:rPr>
           <w:lang w:val="it-IT"/>
         </w:rPr>
         <w:lastRenderedPageBreak/>
-        <w:t xml:space="preserve">Scalabilità </w:t>
-      </w:r>
-      <w:proofErr w:type="spellStart"/>
-      <w:r>
-        <w:rPr>
-          <w:lang w:val="it-IT"/>
-        </w:rPr>
-        <w:t>weak</w:t>
-      </w:r>
-      <w:proofErr w:type="spellEnd"/>
-      <w:r>
-        <w:rPr>
-          <w:lang w:val="it-IT"/>
-        </w:rPr>
-        <w:t xml:space="preserve"> OMP – sistema di test</w:t>
+        <w:t>Scalabilità weak OMP – sistema di test</w:t>
       </w:r>
       <w:bookmarkEnd w:id="17"/>
     </w:p>
@@ -9536,49 +9169,13 @@
         <w:rPr>
           <w:lang w:val="it-IT"/>
         </w:rPr>
-        <w:t xml:space="preserve">Per testare la scalabilità </w:t>
+        <w:t xml:space="preserve">Per testare la scalabilità weak bisogna aumentare il numero di thread mantenendo costante la dimensione del problema per </w:t>
       </w:r>
-      <w:proofErr w:type="spellStart"/>
       <w:r>
         <w:rPr>
           <w:lang w:val="it-IT"/>
         </w:rPr>
-        <w:t>weak</w:t>
-      </w:r>
-      <w:proofErr w:type="spellEnd"/>
-      <w:r>
-        <w:rPr>
-          <w:lang w:val="it-IT"/>
-        </w:rPr>
-        <w:t xml:space="preserve"> bisogna aumentare il numero di </w:t>
-      </w:r>
-      <w:proofErr w:type="spellStart"/>
-      <w:r>
-        <w:rPr>
-          <w:lang w:val="it-IT"/>
-        </w:rPr>
-        <w:t>thread</w:t>
-      </w:r>
-      <w:proofErr w:type="spellEnd"/>
-      <w:r>
-        <w:rPr>
-          <w:lang w:val="it-IT"/>
-        </w:rPr>
-        <w:t xml:space="preserve"> mantenendo costante la dimensione del problema per </w:t>
-      </w:r>
-      <w:proofErr w:type="spellStart"/>
-      <w:r>
-        <w:rPr>
-          <w:lang w:val="it-IT"/>
-        </w:rPr>
-        <w:t>thread</w:t>
-      </w:r>
-      <w:proofErr w:type="spellEnd"/>
-      <w:r>
-        <w:rPr>
-          <w:lang w:val="it-IT"/>
-        </w:rPr>
-        <w:t>, quindi,</w:t>
+        <w:t>thread, quindi,</w:t>
       </w:r>
       <w:r>
         <w:rPr>
@@ -9598,35 +9195,18 @@
         </w:rPr>
         <w:t xml:space="preserve"> per </w:t>
       </w:r>
-      <w:proofErr w:type="spellStart"/>
       <w:r>
         <w:rPr>
           <w:lang w:val="it-IT"/>
         </w:rPr>
         <w:t>thread</w:t>
       </w:r>
-      <w:proofErr w:type="spellEnd"/>
       <w:r>
         <w:rPr>
           <w:lang w:val="it-IT"/>
         </w:rPr>
-        <w:t xml:space="preserve"> costante. Per fare questo con un susseguirsi di esecuzioni sequenziali del programma pilotate da uno script </w:t>
+        <w:t xml:space="preserve"> costante. Per fare questo con un susseguirsi di esecuzioni sequenziali del programma pilotate da uno script sbatch aumento ad ogni esecuzione il numero di </w:t>
       </w:r>
-      <w:proofErr w:type="spellStart"/>
-      <w:r>
-        <w:rPr>
-          <w:lang w:val="it-IT"/>
-        </w:rPr>
-        <w:t>sbatch</w:t>
-      </w:r>
-      <w:proofErr w:type="spellEnd"/>
-      <w:r>
-        <w:rPr>
-          <w:lang w:val="it-IT"/>
-        </w:rPr>
-        <w:t xml:space="preserve"> aumento ad ogni esecuzione il numero di </w:t>
-      </w:r>
-      <w:proofErr w:type="spellStart"/>
       <w:r>
         <w:rPr>
           <w:b/>
@@ -9635,7 +9215,6 @@
         </w:rPr>
         <w:t>thread</w:t>
       </w:r>
-      <w:proofErr w:type="spellEnd"/>
       <w:r>
         <w:rPr>
           <w:lang w:val="it-IT"/>
@@ -9662,26 +9241,12 @@
           <w:lang w:val="it-IT"/>
         </w:rPr>
       </w:pPr>
-      <w:bookmarkStart w:id="18" w:name="_Toc219609071"/>
+      <w:bookmarkStart w:id="18" w:name="_Toc219649648"/>
       <w:r>
         <w:rPr>
           <w:lang w:val="it-IT"/>
         </w:rPr>
-        <w:t xml:space="preserve">Scalabilità </w:t>
-      </w:r>
-      <w:proofErr w:type="spellStart"/>
-      <w:r>
-        <w:rPr>
-          <w:lang w:val="it-IT"/>
-        </w:rPr>
-        <w:t>weak</w:t>
-      </w:r>
-      <w:proofErr w:type="spellEnd"/>
-      <w:r>
-        <w:rPr>
-          <w:lang w:val="it-IT"/>
-        </w:rPr>
-        <w:t xml:space="preserve"> OMP – Dati </w:t>
+        <w:t xml:space="preserve">Scalabilità weak OMP – Dati </w:t>
       </w:r>
       <w:r>
         <w:rPr>
@@ -11440,28 +11005,13 @@
           <w:lang w:val="it-IT"/>
         </w:rPr>
       </w:pPr>
-      <w:bookmarkStart w:id="19" w:name="_Toc219609072"/>
+      <w:bookmarkStart w:id="19" w:name="_Toc219649649"/>
       <w:r>
         <w:rPr>
           <w:lang w:val="it-IT"/>
         </w:rPr>
-        <w:t xml:space="preserve">Scalabilità </w:t>
+        <w:t xml:space="preserve">Scalabilità weak OMP – </w:t>
       </w:r>
-      <w:proofErr w:type="spellStart"/>
-      <w:r>
-        <w:rPr>
-          <w:lang w:val="it-IT"/>
-        </w:rPr>
-        <w:t>weak</w:t>
-      </w:r>
-      <w:proofErr w:type="spellEnd"/>
-      <w:r>
-        <w:rPr>
-          <w:lang w:val="it-IT"/>
-        </w:rPr>
-        <w:t xml:space="preserve"> OMP – </w:t>
-      </w:r>
-      <w:proofErr w:type="spellStart"/>
       <w:r>
         <w:rPr>
           <w:lang w:val="it-IT"/>
@@ -11469,7 +11019,6 @@
         <w:t>Speedup</w:t>
       </w:r>
       <w:bookmarkEnd w:id="19"/>
-      <w:proofErr w:type="spellEnd"/>
     </w:p>
     <w:p>
       <w:pPr>
@@ -11509,27 +11058,13 @@
           <w:lang w:val="it-IT"/>
         </w:rPr>
       </w:pPr>
-      <w:bookmarkStart w:id="20" w:name="_Toc219609073"/>
+      <w:bookmarkStart w:id="20" w:name="_Toc219649650"/>
       <w:r>
         <w:rPr>
           <w:lang w:val="it-IT"/>
         </w:rPr>
         <w:lastRenderedPageBreak/>
-        <w:t xml:space="preserve">Scalabilità </w:t>
-      </w:r>
-      <w:proofErr w:type="spellStart"/>
-      <w:r>
-        <w:rPr>
-          <w:lang w:val="it-IT"/>
-        </w:rPr>
-        <w:t>weak</w:t>
-      </w:r>
-      <w:proofErr w:type="spellEnd"/>
-      <w:r>
-        <w:rPr>
-          <w:lang w:val="it-IT"/>
-        </w:rPr>
-        <w:t xml:space="preserve"> OMP – Efficienza</w:t>
+        <w:t>Scalabilità weak OMP – Efficienza</w:t>
       </w:r>
       <w:bookmarkEnd w:id="20"/>
     </w:p>
@@ -11578,13 +11113,25 @@
         </w:rPr>
         <w:br w:type="page"/>
       </w:r>
-      <w:bookmarkStart w:id="21" w:name="_Toc219609074"/>
+      <w:bookmarkStart w:id="21" w:name="_Toc219649651"/>
       <w:r>
         <w:rPr>
           <w:lang w:val="it-IT"/>
         </w:rPr>
         <w:lastRenderedPageBreak/>
-        <w:t>Grafi di sintesi</w:t>
+        <w:t>Grafi</w:t>
+      </w:r>
+      <w:r>
+        <w:rPr>
+          <w:lang w:val="it-IT"/>
+        </w:rPr>
+        <w:t>ci</w:t>
+      </w:r>
+      <w:r>
+        <w:rPr>
+          <w:lang w:val="it-IT"/>
+        </w:rPr>
+        <w:t xml:space="preserve"> di sintesi</w:t>
       </w:r>
       <w:bookmarkEnd w:id="21"/>
     </w:p>
@@ -11596,7 +11143,7 @@
           <w:lang w:val="it-IT"/>
         </w:rPr>
       </w:pPr>
-      <w:bookmarkStart w:id="22" w:name="_Toc219609075"/>
+      <w:bookmarkStart w:id="22" w:name="_Toc219649652"/>
       <w:r>
         <w:rPr>
           <w:lang w:val="it-IT"/>
@@ -11616,10 +11163,10 @@
           <w:noProof/>
         </w:rPr>
         <w:drawing>
-          <wp:inline distT="0" distB="0" distL="0" distR="0" wp14:anchorId="663D3D4D" wp14:editId="0C2D439D">
-            <wp:extent cx="6858000" cy="4077970"/>
-            <wp:effectExtent l="0" t="0" r="0" b="17780"/>
-            <wp:docPr id="2095803045" name="Chart 1">
+          <wp:inline distT="0" distB="0" distL="0" distR="0" wp14:anchorId="66575A95" wp14:editId="30377F8C">
+            <wp:extent cx="6858000" cy="3336925"/>
+            <wp:effectExtent l="0" t="0" r="0" b="15875"/>
+            <wp:docPr id="1430800192" name="Chart 1">
               <a:extLst xmlns:a="http://schemas.openxmlformats.org/drawingml/2006/main">
                 <a:ext uri="{FF2B5EF4-FFF2-40B4-BE49-F238E27FC236}">
                   <a16:creationId xmlns:a16="http://schemas.microsoft.com/office/drawing/2014/main" id="{717BB887-565F-209B-AC9F-A2FCDE92AB3D}"/>
@@ -11638,29 +11185,27 @@
     </w:p>
     <w:p>
       <w:pPr>
+        <w:rPr>
+          <w:lang w:val="it-IT"/>
+        </w:rPr>
+      </w:pPr>
+    </w:p>
+    <w:p>
+      <w:pPr>
         <w:pStyle w:val="Heading3"/>
         <w:spacing w:after="0"/>
         <w:rPr>
           <w:lang w:val="it-IT"/>
         </w:rPr>
       </w:pPr>
-      <w:bookmarkStart w:id="23" w:name="_Toc219609076"/>
+      <w:bookmarkStart w:id="23" w:name="_Toc219649653"/>
       <w:r>
         <w:rPr>
           <w:lang w:val="it-IT"/>
         </w:rPr>
-        <w:lastRenderedPageBreak/>
-        <w:t xml:space="preserve">Scalabilità </w:t>
-      </w:r>
-      <w:proofErr w:type="spellStart"/>
-      <w:r>
-        <w:rPr>
-          <w:lang w:val="it-IT"/>
-        </w:rPr>
-        <w:t>weak</w:t>
+        <w:t>Scalabilità weak</w:t>
       </w:r>
       <w:bookmarkEnd w:id="23"/>
-      <w:proofErr w:type="spellEnd"/>
     </w:p>
     <w:p>
       <w:pPr>
@@ -11673,10 +11218,10 @@
           <w:noProof/>
         </w:rPr>
         <w:drawing>
-          <wp:inline distT="0" distB="0" distL="0" distR="0" wp14:anchorId="0FB54BF8" wp14:editId="5CE8A5E3">
+          <wp:inline distT="0" distB="0" distL="0" distR="0" wp14:anchorId="1DAD1141" wp14:editId="7D86A84A">
             <wp:extent cx="6858000" cy="4077970"/>
             <wp:effectExtent l="0" t="0" r="0" b="17780"/>
-            <wp:docPr id="1003049851" name="Chart 1">
+            <wp:docPr id="132078917" name="Chart 1">
               <a:extLst xmlns:a="http://schemas.openxmlformats.org/drawingml/2006/main">
                 <a:ext uri="{FF2B5EF4-FFF2-40B4-BE49-F238E27FC236}">
                   <a16:creationId xmlns:a16="http://schemas.microsoft.com/office/drawing/2014/main" id="{96BE8C7D-EAA3-42E5-A62D-0EDE6C48C2AD}"/>
@@ -11702,47 +11247,20 @@
     </w:p>
     <w:p>
       <w:pPr>
-        <w:rPr>
-          <w:lang w:val="it-IT"/>
-        </w:rPr>
-      </w:pPr>
-      <w:r>
-        <w:rPr>
-          <w:lang w:val="it-IT"/>
-        </w:rPr>
-        <w:br w:type="page"/>
-      </w:r>
-    </w:p>
-    <w:p>
-      <w:pPr>
-        <w:rPr>
-          <w:lang w:val="it-IT"/>
-        </w:rPr>
-      </w:pPr>
-    </w:p>
-    <w:p>
-      <w:pPr>
         <w:pStyle w:val="Heading1"/>
         <w:rPr>
           <w:lang w:val="it-IT"/>
         </w:rPr>
       </w:pPr>
-      <w:bookmarkStart w:id="24" w:name="_Toc219609077"/>
+      <w:bookmarkStart w:id="24" w:name="_Toc219649654"/>
       <w:r>
         <w:rPr>
           <w:lang w:val="it-IT"/>
         </w:rPr>
-        <w:t xml:space="preserve">Dati </w:t>
-      </w:r>
-      <w:proofErr w:type="spellStart"/>
-      <w:r>
-        <w:rPr>
-          <w:lang w:val="it-IT"/>
-        </w:rPr>
-        <w:t>raw</w:t>
+        <w:lastRenderedPageBreak/>
+        <w:t>Dati raw</w:t>
       </w:r>
       <w:bookmarkEnd w:id="24"/>
-      <w:proofErr w:type="spellEnd"/>
     </w:p>
     <w:p>
       <w:pPr>
@@ -11834,23 +11352,13 @@
           <w:lang w:val="it-IT"/>
         </w:rPr>
       </w:pPr>
-      <w:proofErr w:type="spellStart"/>
       <w:r>
         <w:rPr>
           <w:sz w:val="22"/>
           <w:szCs w:val="22"/>
           <w:lang w:val="it-IT"/>
         </w:rPr>
-        <w:t>sequentialT</w:t>
-      </w:r>
-      <w:proofErr w:type="spellEnd"/>
-      <w:r>
-        <w:rPr>
-          <w:sz w:val="22"/>
-          <w:szCs w:val="22"/>
-          <w:lang w:val="it-IT"/>
-        </w:rPr>
-        <w:t>=tempo di esecuzione parte sequenziale(secondi) (generazione matrice A)</w:t>
+        <w:t>sequentialT=tempo di esecuzione parte sequenziale(secondi) (generazione matrice A)</w:t>
       </w:r>
     </w:p>
     <w:p>
@@ -11862,23 +11370,13 @@
           <w:lang w:val="it-IT"/>
         </w:rPr>
       </w:pPr>
-      <w:proofErr w:type="spellStart"/>
       <w:r>
         <w:rPr>
           <w:sz w:val="22"/>
           <w:szCs w:val="22"/>
           <w:lang w:val="it-IT"/>
         </w:rPr>
-        <w:t>parallelT</w:t>
-      </w:r>
-      <w:proofErr w:type="spellEnd"/>
-      <w:r>
-        <w:rPr>
-          <w:sz w:val="22"/>
-          <w:szCs w:val="22"/>
-          <w:lang w:val="it-IT"/>
-        </w:rPr>
-        <w:t>=tempo di esecuzione totale(secondi) della parte parallela, (generazione matrice T)</w:t>
+        <w:t>parallelT=tempo di esecuzione totale(secondi) della parte parallela, (generazione matrice T)</w:t>
       </w:r>
     </w:p>
     <w:p>
@@ -11890,23 +11388,13 @@
           <w:lang w:val="it-IT"/>
         </w:rPr>
       </w:pPr>
-      <w:proofErr w:type="spellStart"/>
       <w:r>
         <w:rPr>
           <w:sz w:val="22"/>
           <w:szCs w:val="22"/>
           <w:lang w:val="it-IT"/>
         </w:rPr>
-        <w:t>TotalT</w:t>
-      </w:r>
-      <w:proofErr w:type="spellEnd"/>
-      <w:r>
-        <w:rPr>
-          <w:sz w:val="22"/>
-          <w:szCs w:val="22"/>
-          <w:lang w:val="it-IT"/>
-        </w:rPr>
-        <w:t>=tempo di esecuzione totale(secondi)</w:t>
+        <w:t>TotalT=tempo di esecuzione totale(secondi)</w:t>
       </w:r>
       <w:r>
         <w:rPr>
@@ -12142,7 +11630,6 @@
                 <w14:ligatures w14:val="none"/>
               </w:rPr>
             </w:pPr>
-            <w:proofErr w:type="spellStart"/>
             <w:r>
               <w:rPr>
                 <w:rFonts w:ascii="Calibri" w:hAnsi="Calibri" w:cs="Calibri"/>
@@ -12151,60 +11638,76 @@
                 <w:sz w:val="22"/>
                 <w:szCs w:val="22"/>
               </w:rPr>
-              <w:t>sequentialT</w:t>
-            </w:r>
-            <w:proofErr w:type="spellEnd"/>
-            <w:r>
-              <w:rPr>
-                <w:rFonts w:ascii="Calibri" w:hAnsi="Calibri" w:cs="Calibri"/>
+              <w:t>sequentialT(s)</w:t>
+            </w:r>
+          </w:p>
+        </w:tc>
+        <w:tc>
+          <w:tcPr>
+            <w:tcW w:w="726" w:type="pct"/>
+            <w:tcBorders>
+              <w:top w:val="nil"/>
+              <w:left w:val="nil"/>
+              <w:bottom w:val="single" w:sz="4" w:space="0" w:color="auto"/>
+              <w:right w:val="single" w:sz="4" w:space="0" w:color="auto"/>
+            </w:tcBorders>
+            <w:shd w:val="clear" w:color="000000" w:fill="E2EFDA"/>
+            <w:noWrap/>
+            <w:vAlign w:val="bottom"/>
+            <w:hideMark/>
+          </w:tcPr>
+          <w:p>
+            <w:pPr>
+              <w:spacing w:after="0" w:line="240" w:lineRule="auto"/>
+              <w:rPr>
+                <w:rFonts w:ascii="Calibri" w:eastAsia="Times New Roman" w:hAnsi="Calibri" w:cs="Calibri"/>
                 <w:b/>
                 <w:bCs/>
-                <w:sz w:val="22"/>
-                <w:szCs w:val="22"/>
-              </w:rPr>
-              <w:t>(s)</w:t>
-            </w:r>
-          </w:p>
-        </w:tc>
-        <w:tc>
-          <w:tcPr>
-            <w:tcW w:w="726" w:type="pct"/>
-            <w:tcBorders>
-              <w:top w:val="nil"/>
-              <w:left w:val="nil"/>
-              <w:bottom w:val="single" w:sz="4" w:space="0" w:color="auto"/>
-              <w:right w:val="single" w:sz="4" w:space="0" w:color="auto"/>
-            </w:tcBorders>
-            <w:shd w:val="clear" w:color="000000" w:fill="E2EFDA"/>
-            <w:noWrap/>
-            <w:vAlign w:val="bottom"/>
-            <w:hideMark/>
-          </w:tcPr>
-          <w:p>
-            <w:pPr>
-              <w:spacing w:after="0" w:line="240" w:lineRule="auto"/>
-              <w:rPr>
-                <w:rFonts w:ascii="Calibri" w:eastAsia="Times New Roman" w:hAnsi="Calibri" w:cs="Calibri"/>
+                <w:kern w:val="0"/>
+                <w:sz w:val="22"/>
+                <w:szCs w:val="22"/>
+                <w14:ligatures w14:val="none"/>
+              </w:rPr>
+            </w:pPr>
+            <w:r>
+              <w:rPr>
+                <w:rFonts w:ascii="Calibri" w:hAnsi="Calibri" w:cs="Calibri"/>
                 <w:b/>
                 <w:bCs/>
-                <w:kern w:val="0"/>
-                <w:sz w:val="22"/>
-                <w:szCs w:val="22"/>
-                <w14:ligatures w14:val="none"/>
-              </w:rPr>
-            </w:pPr>
-            <w:proofErr w:type="spellStart"/>
-            <w:r>
-              <w:rPr>
-                <w:rFonts w:ascii="Calibri" w:hAnsi="Calibri" w:cs="Calibri"/>
+                <w:sz w:val="22"/>
+                <w:szCs w:val="22"/>
+              </w:rPr>
+              <w:t>parallelT(s)</w:t>
+            </w:r>
+          </w:p>
+        </w:tc>
+        <w:tc>
+          <w:tcPr>
+            <w:tcW w:w="676" w:type="pct"/>
+            <w:tcBorders>
+              <w:top w:val="nil"/>
+              <w:left w:val="nil"/>
+              <w:bottom w:val="single" w:sz="4" w:space="0" w:color="auto"/>
+              <w:right w:val="single" w:sz="4" w:space="0" w:color="auto"/>
+            </w:tcBorders>
+            <w:shd w:val="clear" w:color="000000" w:fill="E2EFDA"/>
+            <w:noWrap/>
+            <w:vAlign w:val="bottom"/>
+            <w:hideMark/>
+          </w:tcPr>
+          <w:p>
+            <w:pPr>
+              <w:spacing w:after="0" w:line="240" w:lineRule="auto"/>
+              <w:rPr>
+                <w:rFonts w:ascii="Calibri" w:eastAsia="Times New Roman" w:hAnsi="Calibri" w:cs="Calibri"/>
                 <w:b/>
                 <w:bCs/>
-                <w:sz w:val="22"/>
-                <w:szCs w:val="22"/>
-              </w:rPr>
-              <w:t>parallelT</w:t>
-            </w:r>
-            <w:proofErr w:type="spellEnd"/>
+                <w:kern w:val="0"/>
+                <w:sz w:val="22"/>
+                <w:szCs w:val="22"/>
+                <w14:ligatures w14:val="none"/>
+              </w:rPr>
+            </w:pPr>
             <w:r>
               <w:rPr>
                 <w:rFonts w:ascii="Calibri" w:hAnsi="Calibri" w:cs="Calibri"/>
@@ -12213,13 +11716,13 @@
                 <w:sz w:val="22"/>
                 <w:szCs w:val="22"/>
               </w:rPr>
-              <w:t>(s)</w:t>
-            </w:r>
-          </w:p>
-        </w:tc>
-        <w:tc>
-          <w:tcPr>
-            <w:tcW w:w="676" w:type="pct"/>
+              <w:t>totalT(s)</w:t>
+            </w:r>
+          </w:p>
+        </w:tc>
+        <w:tc>
+          <w:tcPr>
+            <w:tcW w:w="403" w:type="pct"/>
             <w:tcBorders>
               <w:top w:val="nil"/>
               <w:left w:val="nil"/>
@@ -12244,7 +11747,6 @@
                 <w14:ligatures w14:val="none"/>
               </w:rPr>
             </w:pPr>
-            <w:proofErr w:type="spellStart"/>
             <w:r>
               <w:rPr>
                 <w:rFonts w:ascii="Calibri" w:hAnsi="Calibri" w:cs="Calibri"/>
@@ -12253,87 +11755,86 @@
                 <w:sz w:val="22"/>
                 <w:szCs w:val="22"/>
               </w:rPr>
-              <w:t>totalT</w:t>
-            </w:r>
-            <w:proofErr w:type="spellEnd"/>
-            <w:r>
-              <w:rPr>
-                <w:rFonts w:ascii="Calibri" w:hAnsi="Calibri" w:cs="Calibri"/>
+              <w:t>nodes</w:t>
+            </w:r>
+          </w:p>
+        </w:tc>
+        <w:tc>
+          <w:tcPr>
+            <w:tcW w:w="829" w:type="pct"/>
+            <w:tcBorders>
+              <w:top w:val="nil"/>
+              <w:left w:val="nil"/>
+              <w:bottom w:val="single" w:sz="4" w:space="0" w:color="auto"/>
+              <w:right w:val="single" w:sz="4" w:space="0" w:color="auto"/>
+            </w:tcBorders>
+            <w:shd w:val="clear" w:color="000000" w:fill="E2EFDA"/>
+            <w:noWrap/>
+            <w:vAlign w:val="bottom"/>
+            <w:hideMark/>
+          </w:tcPr>
+          <w:p>
+            <w:pPr>
+              <w:spacing w:after="0" w:line="240" w:lineRule="auto"/>
+              <w:rPr>
+                <w:rFonts w:ascii="Calibri" w:eastAsia="Times New Roman" w:hAnsi="Calibri" w:cs="Calibri"/>
                 <w:b/>
                 <w:bCs/>
-                <w:sz w:val="22"/>
-                <w:szCs w:val="22"/>
-              </w:rPr>
-              <w:t>(s)</w:t>
-            </w:r>
-          </w:p>
-        </w:tc>
-        <w:tc>
-          <w:tcPr>
-            <w:tcW w:w="403" w:type="pct"/>
-            <w:tcBorders>
-              <w:top w:val="nil"/>
-              <w:left w:val="nil"/>
-              <w:bottom w:val="single" w:sz="4" w:space="0" w:color="auto"/>
-              <w:right w:val="single" w:sz="4" w:space="0" w:color="auto"/>
-            </w:tcBorders>
-            <w:shd w:val="clear" w:color="000000" w:fill="E2EFDA"/>
-            <w:noWrap/>
-            <w:vAlign w:val="bottom"/>
-            <w:hideMark/>
-          </w:tcPr>
-          <w:p>
-            <w:pPr>
-              <w:spacing w:after="0" w:line="240" w:lineRule="auto"/>
-              <w:rPr>
-                <w:rFonts w:ascii="Calibri" w:eastAsia="Times New Roman" w:hAnsi="Calibri" w:cs="Calibri"/>
+                <w:kern w:val="0"/>
+                <w:sz w:val="22"/>
+                <w:szCs w:val="22"/>
+                <w14:ligatures w14:val="none"/>
+              </w:rPr>
+            </w:pPr>
+            <w:r>
+              <w:rPr>
+                <w:rFonts w:ascii="Calibri" w:hAnsi="Calibri" w:cs="Calibri"/>
                 <w:b/>
                 <w:bCs/>
-                <w:kern w:val="0"/>
-                <w:sz w:val="22"/>
-                <w:szCs w:val="22"/>
-                <w14:ligatures w14:val="none"/>
-              </w:rPr>
-            </w:pPr>
-            <w:r>
-              <w:rPr>
-                <w:rFonts w:ascii="Calibri" w:hAnsi="Calibri" w:cs="Calibri"/>
+                <w:sz w:val="22"/>
+                <w:szCs w:val="22"/>
+              </w:rPr>
+              <w:t>Speedup</w:t>
+            </w:r>
+          </w:p>
+        </w:tc>
+        <w:tc>
+          <w:tcPr>
+            <w:tcW w:w="829" w:type="pct"/>
+            <w:tcBorders>
+              <w:top w:val="nil"/>
+              <w:left w:val="nil"/>
+              <w:bottom w:val="single" w:sz="4" w:space="0" w:color="auto"/>
+              <w:right w:val="single" w:sz="4" w:space="0" w:color="auto"/>
+            </w:tcBorders>
+            <w:shd w:val="clear" w:color="000000" w:fill="E2EFDA"/>
+            <w:noWrap/>
+            <w:vAlign w:val="bottom"/>
+            <w:hideMark/>
+          </w:tcPr>
+          <w:p>
+            <w:pPr>
+              <w:spacing w:after="0" w:line="240" w:lineRule="auto"/>
+              <w:rPr>
+                <w:rFonts w:ascii="Calibri" w:eastAsia="Times New Roman" w:hAnsi="Calibri" w:cs="Calibri"/>
                 <w:b/>
                 <w:bCs/>
-                <w:sz w:val="22"/>
-                <w:szCs w:val="22"/>
-              </w:rPr>
-              <w:t>nodes</w:t>
-            </w:r>
-          </w:p>
-        </w:tc>
-        <w:tc>
-          <w:tcPr>
-            <w:tcW w:w="829" w:type="pct"/>
-            <w:tcBorders>
-              <w:top w:val="nil"/>
-              <w:left w:val="nil"/>
-              <w:bottom w:val="single" w:sz="4" w:space="0" w:color="auto"/>
-              <w:right w:val="single" w:sz="4" w:space="0" w:color="auto"/>
-            </w:tcBorders>
-            <w:shd w:val="clear" w:color="000000" w:fill="E2EFDA"/>
-            <w:noWrap/>
-            <w:vAlign w:val="bottom"/>
-            <w:hideMark/>
-          </w:tcPr>
-          <w:p>
-            <w:pPr>
-              <w:spacing w:after="0" w:line="240" w:lineRule="auto"/>
-              <w:rPr>
-                <w:rFonts w:ascii="Calibri" w:eastAsia="Times New Roman" w:hAnsi="Calibri" w:cs="Calibri"/>
+                <w:kern w:val="0"/>
+                <w:sz w:val="22"/>
+                <w:szCs w:val="22"/>
+                <w14:ligatures w14:val="none"/>
+              </w:rPr>
+            </w:pPr>
+            <w:r>
+              <w:rPr>
+                <w:rFonts w:ascii="Calibri" w:hAnsi="Calibri" w:cs="Calibri"/>
                 <w:b/>
                 <w:bCs/>
-                <w:kern w:val="0"/>
-                <w:sz w:val="22"/>
-                <w:szCs w:val="22"/>
-                <w14:ligatures w14:val="none"/>
-              </w:rPr>
-            </w:pPr>
+                <w:sz w:val="22"/>
+                <w:szCs w:val="22"/>
+              </w:rPr>
+              <w:t>Effic</w:t>
+            </w:r>
             <w:r>
               <w:rPr>
                 <w:rFonts w:ascii="Calibri" w:hAnsi="Calibri" w:cs="Calibri"/>
@@ -12342,69 +11843,18 @@
                 <w:sz w:val="22"/>
                 <w:szCs w:val="22"/>
               </w:rPr>
-              <w:t>Speedup</w:t>
-            </w:r>
-          </w:p>
-        </w:tc>
-        <w:tc>
-          <w:tcPr>
-            <w:tcW w:w="829" w:type="pct"/>
-            <w:tcBorders>
-              <w:top w:val="nil"/>
-              <w:left w:val="nil"/>
-              <w:bottom w:val="single" w:sz="4" w:space="0" w:color="auto"/>
-              <w:right w:val="single" w:sz="4" w:space="0" w:color="auto"/>
-            </w:tcBorders>
-            <w:shd w:val="clear" w:color="000000" w:fill="E2EFDA"/>
-            <w:noWrap/>
-            <w:vAlign w:val="bottom"/>
-            <w:hideMark/>
-          </w:tcPr>
-          <w:p>
-            <w:pPr>
-              <w:spacing w:after="0" w:line="240" w:lineRule="auto"/>
-              <w:rPr>
-                <w:rFonts w:ascii="Calibri" w:eastAsia="Times New Roman" w:hAnsi="Calibri" w:cs="Calibri"/>
+              <w:t>i</w:t>
+            </w:r>
+            <w:r>
+              <w:rPr>
+                <w:rFonts w:ascii="Calibri" w:hAnsi="Calibri" w:cs="Calibri"/>
                 <w:b/>
                 <w:bCs/>
-                <w:kern w:val="0"/>
-                <w:sz w:val="22"/>
-                <w:szCs w:val="22"/>
-                <w14:ligatures w14:val="none"/>
-              </w:rPr>
-            </w:pPr>
-            <w:proofErr w:type="spellStart"/>
-            <w:r>
-              <w:rPr>
-                <w:rFonts w:ascii="Calibri" w:hAnsi="Calibri" w:cs="Calibri"/>
-                <w:b/>
-                <w:bCs/>
-                <w:sz w:val="22"/>
-                <w:szCs w:val="22"/>
-              </w:rPr>
-              <w:t>Effic</w:t>
-            </w:r>
-            <w:r>
-              <w:rPr>
-                <w:rFonts w:ascii="Calibri" w:hAnsi="Calibri" w:cs="Calibri"/>
-                <w:b/>
-                <w:bCs/>
-                <w:sz w:val="22"/>
-                <w:szCs w:val="22"/>
-              </w:rPr>
-              <w:t>i</w:t>
-            </w:r>
-            <w:r>
-              <w:rPr>
-                <w:rFonts w:ascii="Calibri" w:hAnsi="Calibri" w:cs="Calibri"/>
-                <w:b/>
-                <w:bCs/>
                 <w:sz w:val="22"/>
                 <w:szCs w:val="22"/>
               </w:rPr>
               <w:t>enza</w:t>
             </w:r>
-            <w:proofErr w:type="spellEnd"/>
           </w:p>
         </w:tc>
       </w:tr>
@@ -16593,14 +16043,12 @@
         </w:rPr>
         <w:t xml:space="preserve">Scalabilità </w:t>
       </w:r>
-      <w:proofErr w:type="spellStart"/>
       <w:r>
         <w:rPr>
           <w:lang w:val="it-IT"/>
         </w:rPr>
         <w:t>weak</w:t>
       </w:r>
-      <w:proofErr w:type="spellEnd"/>
       <w:r>
         <w:rPr>
           <w:lang w:val="it-IT"/>
@@ -16785,7 +16233,6 @@
                 <w14:ligatures w14:val="none"/>
               </w:rPr>
             </w:pPr>
-            <w:proofErr w:type="spellStart"/>
             <w:r>
               <w:rPr>
                 <w:rFonts w:ascii="Calibri" w:eastAsia="Times New Roman" w:hAnsi="Calibri" w:cs="Calibri"/>
@@ -16796,10 +16243,27 @@
                 <w:szCs w:val="22"/>
                 <w14:ligatures w14:val="none"/>
               </w:rPr>
-              <w:t>sequentialT</w:t>
-            </w:r>
-            <w:proofErr w:type="spellEnd"/>
-            <w:r>
+              <w:t>sequentialT(s)</w:t>
+            </w:r>
+          </w:p>
+        </w:tc>
+        <w:tc>
+          <w:tcPr>
+            <w:tcW w:w="726" w:type="pct"/>
+            <w:tcBorders>
+              <w:top w:val="nil"/>
+              <w:left w:val="nil"/>
+              <w:bottom w:val="single" w:sz="4" w:space="0" w:color="auto"/>
+              <w:right w:val="single" w:sz="4" w:space="0" w:color="auto"/>
+            </w:tcBorders>
+            <w:shd w:val="clear" w:color="000000" w:fill="E2EFDA"/>
+            <w:noWrap/>
+            <w:vAlign w:val="bottom"/>
+            <w:hideMark/>
+          </w:tcPr>
+          <w:p>
+            <w:pPr>
+              <w:spacing w:after="0" w:line="240" w:lineRule="auto"/>
               <w:rPr>
                 <w:rFonts w:ascii="Calibri" w:eastAsia="Times New Roman" w:hAnsi="Calibri" w:cs="Calibri"/>
                 <w:b/>
@@ -16809,27 +16273,8 @@
                 <w:szCs w:val="22"/>
                 <w14:ligatures w14:val="none"/>
               </w:rPr>
-              <w:t>(s)</w:t>
-            </w:r>
-          </w:p>
-        </w:tc>
-        <w:tc>
-          <w:tcPr>
-            <w:tcW w:w="726" w:type="pct"/>
-            <w:tcBorders>
-              <w:top w:val="nil"/>
-              <w:left w:val="nil"/>
-              <w:bottom w:val="single" w:sz="4" w:space="0" w:color="auto"/>
-              <w:right w:val="single" w:sz="4" w:space="0" w:color="auto"/>
-            </w:tcBorders>
-            <w:shd w:val="clear" w:color="000000" w:fill="E2EFDA"/>
-            <w:noWrap/>
-            <w:vAlign w:val="bottom"/>
-            <w:hideMark/>
-          </w:tcPr>
-          <w:p>
-            <w:pPr>
-              <w:spacing w:after="0" w:line="240" w:lineRule="auto"/>
+            </w:pPr>
+            <w:r>
               <w:rPr>
                 <w:rFonts w:ascii="Calibri" w:eastAsia="Times New Roman" w:hAnsi="Calibri" w:cs="Calibri"/>
                 <w:b/>
@@ -16839,9 +16284,27 @@
                 <w:szCs w:val="22"/>
                 <w14:ligatures w14:val="none"/>
               </w:rPr>
-            </w:pPr>
-            <w:proofErr w:type="spellStart"/>
-            <w:r>
+              <w:t>parallelT(s)</w:t>
+            </w:r>
+          </w:p>
+        </w:tc>
+        <w:tc>
+          <w:tcPr>
+            <w:tcW w:w="676" w:type="pct"/>
+            <w:tcBorders>
+              <w:top w:val="nil"/>
+              <w:left w:val="nil"/>
+              <w:bottom w:val="single" w:sz="4" w:space="0" w:color="auto"/>
+              <w:right w:val="single" w:sz="4" w:space="0" w:color="auto"/>
+            </w:tcBorders>
+            <w:shd w:val="clear" w:color="000000" w:fill="E2EFDA"/>
+            <w:noWrap/>
+            <w:vAlign w:val="bottom"/>
+            <w:hideMark/>
+          </w:tcPr>
+          <w:p>
+            <w:pPr>
+              <w:spacing w:after="0" w:line="240" w:lineRule="auto"/>
               <w:rPr>
                 <w:rFonts w:ascii="Calibri" w:eastAsia="Times New Roman" w:hAnsi="Calibri" w:cs="Calibri"/>
                 <w:b/>
@@ -16851,9 +16314,7 @@
                 <w:szCs w:val="22"/>
                 <w14:ligatures w14:val="none"/>
               </w:rPr>
-              <w:t>parallelT</w:t>
-            </w:r>
-            <w:proofErr w:type="spellEnd"/>
+            </w:pPr>
             <w:r>
               <w:rPr>
                 <w:rFonts w:ascii="Calibri" w:eastAsia="Times New Roman" w:hAnsi="Calibri" w:cs="Calibri"/>
@@ -16864,13 +16325,13 @@
                 <w:szCs w:val="22"/>
                 <w14:ligatures w14:val="none"/>
               </w:rPr>
-              <w:t>(s)</w:t>
-            </w:r>
-          </w:p>
-        </w:tc>
-        <w:tc>
-          <w:tcPr>
-            <w:tcW w:w="676" w:type="pct"/>
+              <w:t>totalT(s)</w:t>
+            </w:r>
+          </w:p>
+        </w:tc>
+        <w:tc>
+          <w:tcPr>
+            <w:tcW w:w="403" w:type="pct"/>
             <w:tcBorders>
               <w:top w:val="nil"/>
               <w:left w:val="nil"/>
@@ -16895,7 +16356,6 @@
                 <w14:ligatures w14:val="none"/>
               </w:rPr>
             </w:pPr>
-            <w:proofErr w:type="spellStart"/>
             <w:r>
               <w:rPr>
                 <w:rFonts w:ascii="Calibri" w:eastAsia="Times New Roman" w:hAnsi="Calibri" w:cs="Calibri"/>
@@ -16906,10 +16366,27 @@
                 <w:szCs w:val="22"/>
                 <w14:ligatures w14:val="none"/>
               </w:rPr>
-              <w:t>totalT</w:t>
-            </w:r>
-            <w:proofErr w:type="spellEnd"/>
-            <w:r>
+              <w:t>nodes</w:t>
+            </w:r>
+          </w:p>
+        </w:tc>
+        <w:tc>
+          <w:tcPr>
+            <w:tcW w:w="829" w:type="pct"/>
+            <w:tcBorders>
+              <w:top w:val="nil"/>
+              <w:left w:val="nil"/>
+              <w:bottom w:val="single" w:sz="4" w:space="0" w:color="auto"/>
+              <w:right w:val="single" w:sz="4" w:space="0" w:color="auto"/>
+            </w:tcBorders>
+            <w:shd w:val="clear" w:color="000000" w:fill="E2EFDA"/>
+            <w:noWrap/>
+            <w:vAlign w:val="bottom"/>
+            <w:hideMark/>
+          </w:tcPr>
+          <w:p>
+            <w:pPr>
+              <w:spacing w:after="0" w:line="240" w:lineRule="auto"/>
               <w:rPr>
                 <w:rFonts w:ascii="Calibri" w:eastAsia="Times New Roman" w:hAnsi="Calibri" w:cs="Calibri"/>
                 <w:b/>
@@ -16919,27 +16396,8 @@
                 <w:szCs w:val="22"/>
                 <w14:ligatures w14:val="none"/>
               </w:rPr>
-              <w:t>(s)</w:t>
-            </w:r>
-          </w:p>
-        </w:tc>
-        <w:tc>
-          <w:tcPr>
-            <w:tcW w:w="403" w:type="pct"/>
-            <w:tcBorders>
-              <w:top w:val="nil"/>
-              <w:left w:val="nil"/>
-              <w:bottom w:val="single" w:sz="4" w:space="0" w:color="auto"/>
-              <w:right w:val="single" w:sz="4" w:space="0" w:color="auto"/>
-            </w:tcBorders>
-            <w:shd w:val="clear" w:color="000000" w:fill="E2EFDA"/>
-            <w:noWrap/>
-            <w:vAlign w:val="bottom"/>
-            <w:hideMark/>
-          </w:tcPr>
-          <w:p>
-            <w:pPr>
-              <w:spacing w:after="0" w:line="240" w:lineRule="auto"/>
+            </w:pPr>
+            <w:r>
               <w:rPr>
                 <w:rFonts w:ascii="Calibri" w:eastAsia="Times New Roman" w:hAnsi="Calibri" w:cs="Calibri"/>
                 <w:b/>
@@ -16949,8 +16407,27 @@
                 <w:szCs w:val="22"/>
                 <w14:ligatures w14:val="none"/>
               </w:rPr>
-            </w:pPr>
-            <w:r>
+              <w:t>Speedup</w:t>
+            </w:r>
+          </w:p>
+        </w:tc>
+        <w:tc>
+          <w:tcPr>
+            <w:tcW w:w="829" w:type="pct"/>
+            <w:tcBorders>
+              <w:top w:val="nil"/>
+              <w:left w:val="nil"/>
+              <w:bottom w:val="single" w:sz="4" w:space="0" w:color="auto"/>
+              <w:right w:val="single" w:sz="4" w:space="0" w:color="auto"/>
+            </w:tcBorders>
+            <w:shd w:val="clear" w:color="000000" w:fill="E2EFDA"/>
+            <w:noWrap/>
+            <w:vAlign w:val="bottom"/>
+            <w:hideMark/>
+          </w:tcPr>
+          <w:p>
+            <w:pPr>
+              <w:spacing w:after="0" w:line="240" w:lineRule="auto"/>
               <w:rPr>
                 <w:rFonts w:ascii="Calibri" w:eastAsia="Times New Roman" w:hAnsi="Calibri" w:cs="Calibri"/>
                 <w:b/>
@@ -16960,27 +16437,8 @@
                 <w:szCs w:val="22"/>
                 <w14:ligatures w14:val="none"/>
               </w:rPr>
-              <w:t>nodes</w:t>
-            </w:r>
-          </w:p>
-        </w:tc>
-        <w:tc>
-          <w:tcPr>
-            <w:tcW w:w="829" w:type="pct"/>
-            <w:tcBorders>
-              <w:top w:val="nil"/>
-              <w:left w:val="nil"/>
-              <w:bottom w:val="single" w:sz="4" w:space="0" w:color="auto"/>
-              <w:right w:val="single" w:sz="4" w:space="0" w:color="auto"/>
-            </w:tcBorders>
-            <w:shd w:val="clear" w:color="000000" w:fill="E2EFDA"/>
-            <w:noWrap/>
-            <w:vAlign w:val="bottom"/>
-            <w:hideMark/>
-          </w:tcPr>
-          <w:p>
-            <w:pPr>
-              <w:spacing w:after="0" w:line="240" w:lineRule="auto"/>
+            </w:pPr>
+            <w:r>
               <w:rPr>
                 <w:rFonts w:ascii="Calibri" w:eastAsia="Times New Roman" w:hAnsi="Calibri" w:cs="Calibri"/>
                 <w:b/>
@@ -16990,7 +16448,8 @@
                 <w:szCs w:val="22"/>
                 <w14:ligatures w14:val="none"/>
               </w:rPr>
-            </w:pPr>
+              <w:t>Effic</w:t>
+            </w:r>
             <w:r>
               <w:rPr>
                 <w:rFonts w:ascii="Calibri" w:eastAsia="Times New Roman" w:hAnsi="Calibri" w:cs="Calibri"/>
@@ -17001,27 +16460,9 @@
                 <w:szCs w:val="22"/>
                 <w14:ligatures w14:val="none"/>
               </w:rPr>
-              <w:t>Speedup</w:t>
-            </w:r>
-          </w:p>
-        </w:tc>
-        <w:tc>
-          <w:tcPr>
-            <w:tcW w:w="829" w:type="pct"/>
-            <w:tcBorders>
-              <w:top w:val="nil"/>
-              <w:left w:val="nil"/>
-              <w:bottom w:val="single" w:sz="4" w:space="0" w:color="auto"/>
-              <w:right w:val="single" w:sz="4" w:space="0" w:color="auto"/>
-            </w:tcBorders>
-            <w:shd w:val="clear" w:color="000000" w:fill="E2EFDA"/>
-            <w:noWrap/>
-            <w:vAlign w:val="bottom"/>
-            <w:hideMark/>
-          </w:tcPr>
-          <w:p>
-            <w:pPr>
-              <w:spacing w:after="0" w:line="240" w:lineRule="auto"/>
+              <w:t>i</w:t>
+            </w:r>
+            <w:r>
               <w:rPr>
                 <w:rFonts w:ascii="Calibri" w:eastAsia="Times New Roman" w:hAnsi="Calibri" w:cs="Calibri"/>
                 <w:b/>
@@ -17031,45 +16472,8 @@
                 <w:szCs w:val="22"/>
                 <w14:ligatures w14:val="none"/>
               </w:rPr>
-            </w:pPr>
-            <w:proofErr w:type="spellStart"/>
-            <w:r>
-              <w:rPr>
-                <w:rFonts w:ascii="Calibri" w:eastAsia="Times New Roman" w:hAnsi="Calibri" w:cs="Calibri"/>
-                <w:b/>
-                <w:bCs/>
-                <w:kern w:val="0"/>
-                <w:sz w:val="22"/>
-                <w:szCs w:val="22"/>
-                <w14:ligatures w14:val="none"/>
-              </w:rPr>
-              <w:t>Effic</w:t>
-            </w:r>
-            <w:r>
-              <w:rPr>
-                <w:rFonts w:ascii="Calibri" w:eastAsia="Times New Roman" w:hAnsi="Calibri" w:cs="Calibri"/>
-                <w:b/>
-                <w:bCs/>
-                <w:kern w:val="0"/>
-                <w:sz w:val="22"/>
-                <w:szCs w:val="22"/>
-                <w14:ligatures w14:val="none"/>
-              </w:rPr>
-              <w:t>i</w:t>
-            </w:r>
-            <w:r>
-              <w:rPr>
-                <w:rFonts w:ascii="Calibri" w:eastAsia="Times New Roman" w:hAnsi="Calibri" w:cs="Calibri"/>
-                <w:b/>
-                <w:bCs/>
-                <w:kern w:val="0"/>
-                <w:sz w:val="22"/>
-                <w:szCs w:val="22"/>
-                <w14:ligatures w14:val="none"/>
-              </w:rPr>
               <w:t>enza</w:t>
             </w:r>
-            <w:proofErr w:type="spellEnd"/>
           </w:p>
         </w:tc>
       </w:tr>
@@ -21319,7 +20723,6 @@
                 <w14:ligatures w14:val="none"/>
               </w:rPr>
             </w:pPr>
-            <w:proofErr w:type="spellStart"/>
             <w:r>
               <w:rPr>
                 <w:rFonts w:ascii="Calibri" w:eastAsia="Times New Roman" w:hAnsi="Calibri" w:cs="Calibri"/>
@@ -21330,10 +20733,27 @@
                 <w:szCs w:val="22"/>
                 <w14:ligatures w14:val="none"/>
               </w:rPr>
-              <w:t>sequentialT</w:t>
-            </w:r>
-            <w:proofErr w:type="spellEnd"/>
-            <w:r>
+              <w:t>sequentialT(s)</w:t>
+            </w:r>
+          </w:p>
+        </w:tc>
+        <w:tc>
+          <w:tcPr>
+            <w:tcW w:w="638" w:type="pct"/>
+            <w:tcBorders>
+              <w:top w:val="nil"/>
+              <w:left w:val="nil"/>
+              <w:bottom w:val="single" w:sz="4" w:space="0" w:color="auto"/>
+              <w:right w:val="single" w:sz="4" w:space="0" w:color="auto"/>
+            </w:tcBorders>
+            <w:shd w:val="clear" w:color="000000" w:fill="E2EFDA"/>
+            <w:noWrap/>
+            <w:vAlign w:val="bottom"/>
+            <w:hideMark/>
+          </w:tcPr>
+          <w:p>
+            <w:pPr>
+              <w:spacing w:after="0" w:line="240" w:lineRule="auto"/>
               <w:rPr>
                 <w:rFonts w:ascii="Calibri" w:eastAsia="Times New Roman" w:hAnsi="Calibri" w:cs="Calibri"/>
                 <w:b/>
@@ -21343,27 +20763,8 @@
                 <w:szCs w:val="22"/>
                 <w14:ligatures w14:val="none"/>
               </w:rPr>
-              <w:t>(s)</w:t>
-            </w:r>
-          </w:p>
-        </w:tc>
-        <w:tc>
-          <w:tcPr>
-            <w:tcW w:w="638" w:type="pct"/>
-            <w:tcBorders>
-              <w:top w:val="nil"/>
-              <w:left w:val="nil"/>
-              <w:bottom w:val="single" w:sz="4" w:space="0" w:color="auto"/>
-              <w:right w:val="single" w:sz="4" w:space="0" w:color="auto"/>
-            </w:tcBorders>
-            <w:shd w:val="clear" w:color="000000" w:fill="E2EFDA"/>
-            <w:noWrap/>
-            <w:vAlign w:val="bottom"/>
-            <w:hideMark/>
-          </w:tcPr>
-          <w:p>
-            <w:pPr>
-              <w:spacing w:after="0" w:line="240" w:lineRule="auto"/>
+            </w:pPr>
+            <w:r>
               <w:rPr>
                 <w:rFonts w:ascii="Calibri" w:eastAsia="Times New Roman" w:hAnsi="Calibri" w:cs="Calibri"/>
                 <w:b/>
@@ -21373,9 +20774,27 @@
                 <w:szCs w:val="22"/>
                 <w14:ligatures w14:val="none"/>
               </w:rPr>
-            </w:pPr>
-            <w:proofErr w:type="spellStart"/>
-            <w:r>
+              <w:t>parallelT(s)</w:t>
+            </w:r>
+          </w:p>
+        </w:tc>
+        <w:tc>
+          <w:tcPr>
+            <w:tcW w:w="526" w:type="pct"/>
+            <w:tcBorders>
+              <w:top w:val="nil"/>
+              <w:left w:val="nil"/>
+              <w:bottom w:val="single" w:sz="4" w:space="0" w:color="auto"/>
+              <w:right w:val="single" w:sz="4" w:space="0" w:color="auto"/>
+            </w:tcBorders>
+            <w:shd w:val="clear" w:color="000000" w:fill="E2EFDA"/>
+            <w:noWrap/>
+            <w:vAlign w:val="bottom"/>
+            <w:hideMark/>
+          </w:tcPr>
+          <w:p>
+            <w:pPr>
+              <w:spacing w:after="0" w:line="240" w:lineRule="auto"/>
               <w:rPr>
                 <w:rFonts w:ascii="Calibri" w:eastAsia="Times New Roman" w:hAnsi="Calibri" w:cs="Calibri"/>
                 <w:b/>
@@ -21385,9 +20804,7 @@
                 <w:szCs w:val="22"/>
                 <w14:ligatures w14:val="none"/>
               </w:rPr>
-              <w:t>parallelT</w:t>
-            </w:r>
-            <w:proofErr w:type="spellEnd"/>
+            </w:pPr>
             <w:r>
               <w:rPr>
                 <w:rFonts w:ascii="Calibri" w:eastAsia="Times New Roman" w:hAnsi="Calibri" w:cs="Calibri"/>
@@ -21398,13 +20815,13 @@
                 <w:szCs w:val="22"/>
                 <w14:ligatures w14:val="none"/>
               </w:rPr>
-              <w:t>(s)</w:t>
-            </w:r>
-          </w:p>
-        </w:tc>
-        <w:tc>
-          <w:tcPr>
-            <w:tcW w:w="526" w:type="pct"/>
+              <w:t>totalT(s)</w:t>
+            </w:r>
+          </w:p>
+        </w:tc>
+        <w:tc>
+          <w:tcPr>
+            <w:tcW w:w="382" w:type="pct"/>
             <w:tcBorders>
               <w:top w:val="nil"/>
               <w:left w:val="nil"/>
@@ -21429,7 +20846,6 @@
                 <w14:ligatures w14:val="none"/>
               </w:rPr>
             </w:pPr>
-            <w:proofErr w:type="spellStart"/>
             <w:r>
               <w:rPr>
                 <w:rFonts w:ascii="Calibri" w:eastAsia="Times New Roman" w:hAnsi="Calibri" w:cs="Calibri"/>
@@ -21440,10 +20856,27 @@
                 <w:szCs w:val="22"/>
                 <w14:ligatures w14:val="none"/>
               </w:rPr>
-              <w:t>totalT</w:t>
-            </w:r>
-            <w:proofErr w:type="spellEnd"/>
-            <w:r>
+              <w:t>nodes</w:t>
+            </w:r>
+          </w:p>
+        </w:tc>
+        <w:tc>
+          <w:tcPr>
+            <w:tcW w:w="526" w:type="pct"/>
+            <w:tcBorders>
+              <w:top w:val="nil"/>
+              <w:left w:val="nil"/>
+              <w:bottom w:val="single" w:sz="4" w:space="0" w:color="auto"/>
+              <w:right w:val="single" w:sz="4" w:space="0" w:color="auto"/>
+            </w:tcBorders>
+            <w:shd w:val="clear" w:color="000000" w:fill="E2EFDA"/>
+            <w:noWrap/>
+            <w:vAlign w:val="bottom"/>
+            <w:hideMark/>
+          </w:tcPr>
+          <w:p>
+            <w:pPr>
+              <w:spacing w:after="0" w:line="240" w:lineRule="auto"/>
               <w:rPr>
                 <w:rFonts w:ascii="Calibri" w:eastAsia="Times New Roman" w:hAnsi="Calibri" w:cs="Calibri"/>
                 <w:b/>
@@ -21453,27 +20886,8 @@
                 <w:szCs w:val="22"/>
                 <w14:ligatures w14:val="none"/>
               </w:rPr>
-              <w:t>(s)</w:t>
-            </w:r>
-          </w:p>
-        </w:tc>
-        <w:tc>
-          <w:tcPr>
-            <w:tcW w:w="382" w:type="pct"/>
-            <w:tcBorders>
-              <w:top w:val="nil"/>
-              <w:left w:val="nil"/>
-              <w:bottom w:val="single" w:sz="4" w:space="0" w:color="auto"/>
-              <w:right w:val="single" w:sz="4" w:space="0" w:color="auto"/>
-            </w:tcBorders>
-            <w:shd w:val="clear" w:color="000000" w:fill="E2EFDA"/>
-            <w:noWrap/>
-            <w:vAlign w:val="bottom"/>
-            <w:hideMark/>
-          </w:tcPr>
-          <w:p>
-            <w:pPr>
-              <w:spacing w:after="0" w:line="240" w:lineRule="auto"/>
+            </w:pPr>
+            <w:r>
               <w:rPr>
                 <w:rFonts w:ascii="Calibri" w:eastAsia="Times New Roman" w:hAnsi="Calibri" w:cs="Calibri"/>
                 <w:b/>
@@ -21483,8 +20897,27 @@
                 <w:szCs w:val="22"/>
                 <w14:ligatures w14:val="none"/>
               </w:rPr>
-            </w:pPr>
-            <w:r>
+              <w:t>Speedup</w:t>
+            </w:r>
+          </w:p>
+        </w:tc>
+        <w:tc>
+          <w:tcPr>
+            <w:tcW w:w="1522" w:type="pct"/>
+            <w:tcBorders>
+              <w:top w:val="nil"/>
+              <w:left w:val="nil"/>
+              <w:bottom w:val="single" w:sz="4" w:space="0" w:color="auto"/>
+              <w:right w:val="single" w:sz="4" w:space="0" w:color="auto"/>
+            </w:tcBorders>
+            <w:shd w:val="clear" w:color="000000" w:fill="E2EFDA"/>
+            <w:noWrap/>
+            <w:vAlign w:val="bottom"/>
+            <w:hideMark/>
+          </w:tcPr>
+          <w:p>
+            <w:pPr>
+              <w:spacing w:after="0" w:line="240" w:lineRule="auto"/>
               <w:rPr>
                 <w:rFonts w:ascii="Calibri" w:eastAsia="Times New Roman" w:hAnsi="Calibri" w:cs="Calibri"/>
                 <w:b/>
@@ -21494,27 +20927,8 @@
                 <w:szCs w:val="22"/>
                 <w14:ligatures w14:val="none"/>
               </w:rPr>
-              <w:t>nodes</w:t>
-            </w:r>
-          </w:p>
-        </w:tc>
-        <w:tc>
-          <w:tcPr>
-            <w:tcW w:w="526" w:type="pct"/>
-            <w:tcBorders>
-              <w:top w:val="nil"/>
-              <w:left w:val="nil"/>
-              <w:bottom w:val="single" w:sz="4" w:space="0" w:color="auto"/>
-              <w:right w:val="single" w:sz="4" w:space="0" w:color="auto"/>
-            </w:tcBorders>
-            <w:shd w:val="clear" w:color="000000" w:fill="E2EFDA"/>
-            <w:noWrap/>
-            <w:vAlign w:val="bottom"/>
-            <w:hideMark/>
-          </w:tcPr>
-          <w:p>
-            <w:pPr>
-              <w:spacing w:after="0" w:line="240" w:lineRule="auto"/>
+            </w:pPr>
+            <w:r>
               <w:rPr>
                 <w:rFonts w:ascii="Calibri" w:eastAsia="Times New Roman" w:hAnsi="Calibri" w:cs="Calibri"/>
                 <w:b/>
@@ -21524,7 +20938,8 @@
                 <w:szCs w:val="22"/>
                 <w14:ligatures w14:val="none"/>
               </w:rPr>
-            </w:pPr>
+              <w:t>Effic</w:t>
+            </w:r>
             <w:r>
               <w:rPr>
                 <w:rFonts w:ascii="Calibri" w:eastAsia="Times New Roman" w:hAnsi="Calibri" w:cs="Calibri"/>
@@ -21535,27 +20950,9 @@
                 <w:szCs w:val="22"/>
                 <w14:ligatures w14:val="none"/>
               </w:rPr>
-              <w:t>Speedup</w:t>
-            </w:r>
-          </w:p>
-        </w:tc>
-        <w:tc>
-          <w:tcPr>
-            <w:tcW w:w="1522" w:type="pct"/>
-            <w:tcBorders>
-              <w:top w:val="nil"/>
-              <w:left w:val="nil"/>
-              <w:bottom w:val="single" w:sz="4" w:space="0" w:color="auto"/>
-              <w:right w:val="single" w:sz="4" w:space="0" w:color="auto"/>
-            </w:tcBorders>
-            <w:shd w:val="clear" w:color="000000" w:fill="E2EFDA"/>
-            <w:noWrap/>
-            <w:vAlign w:val="bottom"/>
-            <w:hideMark/>
-          </w:tcPr>
-          <w:p>
-            <w:pPr>
-              <w:spacing w:after="0" w:line="240" w:lineRule="auto"/>
+              <w:t>i</w:t>
+            </w:r>
+            <w:r>
               <w:rPr>
                 <w:rFonts w:ascii="Calibri" w:eastAsia="Times New Roman" w:hAnsi="Calibri" w:cs="Calibri"/>
                 <w:b/>
@@ -21565,45 +20962,8 @@
                 <w:szCs w:val="22"/>
                 <w14:ligatures w14:val="none"/>
               </w:rPr>
-            </w:pPr>
-            <w:proofErr w:type="spellStart"/>
-            <w:r>
-              <w:rPr>
-                <w:rFonts w:ascii="Calibri" w:eastAsia="Times New Roman" w:hAnsi="Calibri" w:cs="Calibri"/>
-                <w:b/>
-                <w:bCs/>
-                <w:kern w:val="0"/>
-                <w:sz w:val="22"/>
-                <w:szCs w:val="22"/>
-                <w14:ligatures w14:val="none"/>
-              </w:rPr>
-              <w:t>Effic</w:t>
-            </w:r>
-            <w:r>
-              <w:rPr>
-                <w:rFonts w:ascii="Calibri" w:eastAsia="Times New Roman" w:hAnsi="Calibri" w:cs="Calibri"/>
-                <w:b/>
-                <w:bCs/>
-                <w:kern w:val="0"/>
-                <w:sz w:val="22"/>
-                <w:szCs w:val="22"/>
-                <w14:ligatures w14:val="none"/>
-              </w:rPr>
-              <w:t>i</w:t>
-            </w:r>
-            <w:r>
-              <w:rPr>
-                <w:rFonts w:ascii="Calibri" w:eastAsia="Times New Roman" w:hAnsi="Calibri" w:cs="Calibri"/>
-                <w:b/>
-                <w:bCs/>
-                <w:kern w:val="0"/>
-                <w:sz w:val="22"/>
-                <w:szCs w:val="22"/>
-                <w14:ligatures w14:val="none"/>
-              </w:rPr>
               <w:t>enza</w:t>
             </w:r>
-            <w:proofErr w:type="spellEnd"/>
           </w:p>
         </w:tc>
       </w:tr>
@@ -25580,14 +24940,12 @@
         </w:rPr>
         <w:t xml:space="preserve">Scalabilità </w:t>
       </w:r>
-      <w:proofErr w:type="spellStart"/>
       <w:r>
         <w:rPr>
           <w:lang w:val="it-IT"/>
         </w:rPr>
         <w:t>weak</w:t>
       </w:r>
-      <w:proofErr w:type="spellEnd"/>
       <w:r>
         <w:rPr>
           <w:lang w:val="it-IT"/>
@@ -25787,7 +25145,6 @@
                 <w14:ligatures w14:val="none"/>
               </w:rPr>
             </w:pPr>
-            <w:proofErr w:type="spellStart"/>
             <w:r>
               <w:rPr>
                 <w:rFonts w:ascii="Calibri" w:hAnsi="Calibri" w:cs="Calibri"/>
@@ -25796,60 +25153,76 @@
                 <w:sz w:val="22"/>
                 <w:szCs w:val="22"/>
               </w:rPr>
-              <w:t>sequentialT</w:t>
-            </w:r>
-            <w:proofErr w:type="spellEnd"/>
-            <w:r>
-              <w:rPr>
-                <w:rFonts w:ascii="Calibri" w:hAnsi="Calibri" w:cs="Calibri"/>
+              <w:t>sequentialT(s)</w:t>
+            </w:r>
+          </w:p>
+        </w:tc>
+        <w:tc>
+          <w:tcPr>
+            <w:tcW w:w="638" w:type="pct"/>
+            <w:tcBorders>
+              <w:top w:val="nil"/>
+              <w:left w:val="nil"/>
+              <w:bottom w:val="single" w:sz="4" w:space="0" w:color="auto"/>
+              <w:right w:val="single" w:sz="4" w:space="0" w:color="auto"/>
+            </w:tcBorders>
+            <w:shd w:val="clear" w:color="000000" w:fill="E2EFDA"/>
+            <w:noWrap/>
+            <w:vAlign w:val="bottom"/>
+            <w:hideMark/>
+          </w:tcPr>
+          <w:p>
+            <w:pPr>
+              <w:spacing w:after="0" w:line="240" w:lineRule="auto"/>
+              <w:rPr>
+                <w:rFonts w:ascii="Calibri" w:eastAsia="Times New Roman" w:hAnsi="Calibri" w:cs="Calibri"/>
                 <w:b/>
                 <w:bCs/>
-                <w:sz w:val="22"/>
-                <w:szCs w:val="22"/>
-              </w:rPr>
-              <w:t>(s)</w:t>
-            </w:r>
-          </w:p>
-        </w:tc>
-        <w:tc>
-          <w:tcPr>
-            <w:tcW w:w="638" w:type="pct"/>
-            <w:tcBorders>
-              <w:top w:val="nil"/>
-              <w:left w:val="nil"/>
-              <w:bottom w:val="single" w:sz="4" w:space="0" w:color="auto"/>
-              <w:right w:val="single" w:sz="4" w:space="0" w:color="auto"/>
-            </w:tcBorders>
-            <w:shd w:val="clear" w:color="000000" w:fill="E2EFDA"/>
-            <w:noWrap/>
-            <w:vAlign w:val="bottom"/>
-            <w:hideMark/>
-          </w:tcPr>
-          <w:p>
-            <w:pPr>
-              <w:spacing w:after="0" w:line="240" w:lineRule="auto"/>
-              <w:rPr>
-                <w:rFonts w:ascii="Calibri" w:eastAsia="Times New Roman" w:hAnsi="Calibri" w:cs="Calibri"/>
+                <w:kern w:val="0"/>
+                <w:sz w:val="22"/>
+                <w:szCs w:val="22"/>
+                <w14:ligatures w14:val="none"/>
+              </w:rPr>
+            </w:pPr>
+            <w:r>
+              <w:rPr>
+                <w:rFonts w:ascii="Calibri" w:hAnsi="Calibri" w:cs="Calibri"/>
                 <w:b/>
                 <w:bCs/>
-                <w:kern w:val="0"/>
-                <w:sz w:val="22"/>
-                <w:szCs w:val="22"/>
-                <w14:ligatures w14:val="none"/>
-              </w:rPr>
-            </w:pPr>
-            <w:proofErr w:type="spellStart"/>
-            <w:r>
-              <w:rPr>
-                <w:rFonts w:ascii="Calibri" w:hAnsi="Calibri" w:cs="Calibri"/>
+                <w:sz w:val="22"/>
+                <w:szCs w:val="22"/>
+              </w:rPr>
+              <w:t>parallelT(s)</w:t>
+            </w:r>
+          </w:p>
+        </w:tc>
+        <w:tc>
+          <w:tcPr>
+            <w:tcW w:w="526" w:type="pct"/>
+            <w:tcBorders>
+              <w:top w:val="nil"/>
+              <w:left w:val="nil"/>
+              <w:bottom w:val="single" w:sz="4" w:space="0" w:color="auto"/>
+              <w:right w:val="single" w:sz="4" w:space="0" w:color="auto"/>
+            </w:tcBorders>
+            <w:shd w:val="clear" w:color="000000" w:fill="E2EFDA"/>
+            <w:noWrap/>
+            <w:vAlign w:val="bottom"/>
+            <w:hideMark/>
+          </w:tcPr>
+          <w:p>
+            <w:pPr>
+              <w:spacing w:after="0" w:line="240" w:lineRule="auto"/>
+              <w:rPr>
+                <w:rFonts w:ascii="Calibri" w:eastAsia="Times New Roman" w:hAnsi="Calibri" w:cs="Calibri"/>
                 <w:b/>
                 <w:bCs/>
-                <w:sz w:val="22"/>
-                <w:szCs w:val="22"/>
-              </w:rPr>
-              <w:t>parallelT</w:t>
-            </w:r>
-            <w:proofErr w:type="spellEnd"/>
+                <w:kern w:val="0"/>
+                <w:sz w:val="22"/>
+                <w:szCs w:val="22"/>
+                <w14:ligatures w14:val="none"/>
+              </w:rPr>
+            </w:pPr>
             <w:r>
               <w:rPr>
                 <w:rFonts w:ascii="Calibri" w:hAnsi="Calibri" w:cs="Calibri"/>
@@ -25858,13 +25231,13 @@
                 <w:sz w:val="22"/>
                 <w:szCs w:val="22"/>
               </w:rPr>
-              <w:t>(s)</w:t>
-            </w:r>
-          </w:p>
-        </w:tc>
-        <w:tc>
-          <w:tcPr>
-            <w:tcW w:w="526" w:type="pct"/>
+              <w:t>totalT(s)</w:t>
+            </w:r>
+          </w:p>
+        </w:tc>
+        <w:tc>
+          <w:tcPr>
+            <w:tcW w:w="382" w:type="pct"/>
             <w:tcBorders>
               <w:top w:val="nil"/>
               <w:left w:val="nil"/>
@@ -25889,7 +25262,6 @@
                 <w14:ligatures w14:val="none"/>
               </w:rPr>
             </w:pPr>
-            <w:proofErr w:type="spellStart"/>
             <w:r>
               <w:rPr>
                 <w:rFonts w:ascii="Calibri" w:hAnsi="Calibri" w:cs="Calibri"/>
@@ -25898,87 +25270,86 @@
                 <w:sz w:val="22"/>
                 <w:szCs w:val="22"/>
               </w:rPr>
-              <w:t>totalT</w:t>
-            </w:r>
-            <w:proofErr w:type="spellEnd"/>
-            <w:r>
-              <w:rPr>
-                <w:rFonts w:ascii="Calibri" w:hAnsi="Calibri" w:cs="Calibri"/>
+              <w:t>nodes</w:t>
+            </w:r>
+          </w:p>
+        </w:tc>
+        <w:tc>
+          <w:tcPr>
+            <w:tcW w:w="526" w:type="pct"/>
+            <w:tcBorders>
+              <w:top w:val="nil"/>
+              <w:left w:val="nil"/>
+              <w:bottom w:val="single" w:sz="4" w:space="0" w:color="auto"/>
+              <w:right w:val="single" w:sz="4" w:space="0" w:color="auto"/>
+            </w:tcBorders>
+            <w:shd w:val="clear" w:color="000000" w:fill="E2EFDA"/>
+            <w:noWrap/>
+            <w:vAlign w:val="bottom"/>
+            <w:hideMark/>
+          </w:tcPr>
+          <w:p>
+            <w:pPr>
+              <w:spacing w:after="0" w:line="240" w:lineRule="auto"/>
+              <w:rPr>
+                <w:rFonts w:ascii="Calibri" w:eastAsia="Times New Roman" w:hAnsi="Calibri" w:cs="Calibri"/>
                 <w:b/>
                 <w:bCs/>
-                <w:sz w:val="22"/>
-                <w:szCs w:val="22"/>
-              </w:rPr>
-              <w:t>(s)</w:t>
-            </w:r>
-          </w:p>
-        </w:tc>
-        <w:tc>
-          <w:tcPr>
-            <w:tcW w:w="382" w:type="pct"/>
-            <w:tcBorders>
-              <w:top w:val="nil"/>
-              <w:left w:val="nil"/>
-              <w:bottom w:val="single" w:sz="4" w:space="0" w:color="auto"/>
-              <w:right w:val="single" w:sz="4" w:space="0" w:color="auto"/>
-            </w:tcBorders>
-            <w:shd w:val="clear" w:color="000000" w:fill="E2EFDA"/>
-            <w:noWrap/>
-            <w:vAlign w:val="bottom"/>
-            <w:hideMark/>
-          </w:tcPr>
-          <w:p>
-            <w:pPr>
-              <w:spacing w:after="0" w:line="240" w:lineRule="auto"/>
-              <w:rPr>
-                <w:rFonts w:ascii="Calibri" w:eastAsia="Times New Roman" w:hAnsi="Calibri" w:cs="Calibri"/>
+                <w:kern w:val="0"/>
+                <w:sz w:val="22"/>
+                <w:szCs w:val="22"/>
+                <w14:ligatures w14:val="none"/>
+              </w:rPr>
+            </w:pPr>
+            <w:r>
+              <w:rPr>
+                <w:rFonts w:ascii="Calibri" w:hAnsi="Calibri" w:cs="Calibri"/>
                 <w:b/>
                 <w:bCs/>
-                <w:kern w:val="0"/>
-                <w:sz w:val="22"/>
-                <w:szCs w:val="22"/>
-                <w14:ligatures w14:val="none"/>
-              </w:rPr>
-            </w:pPr>
-            <w:r>
-              <w:rPr>
-                <w:rFonts w:ascii="Calibri" w:hAnsi="Calibri" w:cs="Calibri"/>
+                <w:sz w:val="22"/>
+                <w:szCs w:val="22"/>
+              </w:rPr>
+              <w:t>Speedup</w:t>
+            </w:r>
+          </w:p>
+        </w:tc>
+        <w:tc>
+          <w:tcPr>
+            <w:tcW w:w="1522" w:type="pct"/>
+            <w:tcBorders>
+              <w:top w:val="nil"/>
+              <w:left w:val="nil"/>
+              <w:bottom w:val="single" w:sz="4" w:space="0" w:color="auto"/>
+              <w:right w:val="single" w:sz="4" w:space="0" w:color="auto"/>
+            </w:tcBorders>
+            <w:shd w:val="clear" w:color="000000" w:fill="E2EFDA"/>
+            <w:noWrap/>
+            <w:vAlign w:val="bottom"/>
+            <w:hideMark/>
+          </w:tcPr>
+          <w:p>
+            <w:pPr>
+              <w:spacing w:after="0" w:line="240" w:lineRule="auto"/>
+              <w:rPr>
+                <w:rFonts w:ascii="Calibri" w:eastAsia="Times New Roman" w:hAnsi="Calibri" w:cs="Calibri"/>
                 <w:b/>
                 <w:bCs/>
-                <w:sz w:val="22"/>
-                <w:szCs w:val="22"/>
-              </w:rPr>
-              <w:t>nodes</w:t>
-            </w:r>
-          </w:p>
-        </w:tc>
-        <w:tc>
-          <w:tcPr>
-            <w:tcW w:w="526" w:type="pct"/>
-            <w:tcBorders>
-              <w:top w:val="nil"/>
-              <w:left w:val="nil"/>
-              <w:bottom w:val="single" w:sz="4" w:space="0" w:color="auto"/>
-              <w:right w:val="single" w:sz="4" w:space="0" w:color="auto"/>
-            </w:tcBorders>
-            <w:shd w:val="clear" w:color="000000" w:fill="E2EFDA"/>
-            <w:noWrap/>
-            <w:vAlign w:val="bottom"/>
-            <w:hideMark/>
-          </w:tcPr>
-          <w:p>
-            <w:pPr>
-              <w:spacing w:after="0" w:line="240" w:lineRule="auto"/>
-              <w:rPr>
-                <w:rFonts w:ascii="Calibri" w:eastAsia="Times New Roman" w:hAnsi="Calibri" w:cs="Calibri"/>
+                <w:kern w:val="0"/>
+                <w:sz w:val="22"/>
+                <w:szCs w:val="22"/>
+                <w14:ligatures w14:val="none"/>
+              </w:rPr>
+            </w:pPr>
+            <w:r>
+              <w:rPr>
+                <w:rFonts w:ascii="Calibri" w:hAnsi="Calibri" w:cs="Calibri"/>
                 <w:b/>
                 <w:bCs/>
-                <w:kern w:val="0"/>
-                <w:sz w:val="22"/>
-                <w:szCs w:val="22"/>
-                <w14:ligatures w14:val="none"/>
-              </w:rPr>
-            </w:pPr>
+                <w:sz w:val="22"/>
+                <w:szCs w:val="22"/>
+              </w:rPr>
+              <w:t>Effic</w:t>
+            </w:r>
             <w:r>
               <w:rPr>
                 <w:rFonts w:ascii="Calibri" w:hAnsi="Calibri" w:cs="Calibri"/>
@@ -25987,69 +25358,18 @@
                 <w:sz w:val="22"/>
                 <w:szCs w:val="22"/>
               </w:rPr>
-              <w:t>Speedup</w:t>
-            </w:r>
-          </w:p>
-        </w:tc>
-        <w:tc>
-          <w:tcPr>
-            <w:tcW w:w="1522" w:type="pct"/>
-            <w:tcBorders>
-              <w:top w:val="nil"/>
-              <w:left w:val="nil"/>
-              <w:bottom w:val="single" w:sz="4" w:space="0" w:color="auto"/>
-              <w:right w:val="single" w:sz="4" w:space="0" w:color="auto"/>
-            </w:tcBorders>
-            <w:shd w:val="clear" w:color="000000" w:fill="E2EFDA"/>
-            <w:noWrap/>
-            <w:vAlign w:val="bottom"/>
-            <w:hideMark/>
-          </w:tcPr>
-          <w:p>
-            <w:pPr>
-              <w:spacing w:after="0" w:line="240" w:lineRule="auto"/>
-              <w:rPr>
-                <w:rFonts w:ascii="Calibri" w:eastAsia="Times New Roman" w:hAnsi="Calibri" w:cs="Calibri"/>
+              <w:t>i</w:t>
+            </w:r>
+            <w:r>
+              <w:rPr>
+                <w:rFonts w:ascii="Calibri" w:hAnsi="Calibri" w:cs="Calibri"/>
                 <w:b/>
                 <w:bCs/>
-                <w:kern w:val="0"/>
-                <w:sz w:val="22"/>
-                <w:szCs w:val="22"/>
-                <w14:ligatures w14:val="none"/>
-              </w:rPr>
-            </w:pPr>
-            <w:proofErr w:type="spellStart"/>
-            <w:r>
-              <w:rPr>
-                <w:rFonts w:ascii="Calibri" w:hAnsi="Calibri" w:cs="Calibri"/>
-                <w:b/>
-                <w:bCs/>
-                <w:sz w:val="22"/>
-                <w:szCs w:val="22"/>
-              </w:rPr>
-              <w:t>Effic</w:t>
-            </w:r>
-            <w:r>
-              <w:rPr>
-                <w:rFonts w:ascii="Calibri" w:hAnsi="Calibri" w:cs="Calibri"/>
-                <w:b/>
-                <w:bCs/>
-                <w:sz w:val="22"/>
-                <w:szCs w:val="22"/>
-              </w:rPr>
-              <w:t>i</w:t>
-            </w:r>
-            <w:r>
-              <w:rPr>
-                <w:rFonts w:ascii="Calibri" w:hAnsi="Calibri" w:cs="Calibri"/>
-                <w:b/>
-                <w:bCs/>
                 <w:sz w:val="22"/>
                 <w:szCs w:val="22"/>
               </w:rPr>
               <w:t>enza</w:t>
             </w:r>
-            <w:proofErr w:type="spellEnd"/>
           </w:p>
         </w:tc>
       </w:tr>
@@ -30042,7 +29362,7 @@
           <w:lang w:val="it-IT"/>
         </w:rPr>
       </w:pPr>
-      <w:bookmarkStart w:id="25" w:name="_Toc219609078"/>
+      <w:bookmarkStart w:id="25" w:name="_Toc219649655"/>
       <w:r>
         <w:rPr>
           <w:lang w:val="it-IT"/>
@@ -30104,21 +29424,7 @@
         <w:rPr>
           <w:lang w:val="it-IT"/>
         </w:rPr>
-        <w:t xml:space="preserve">, il grafico di </w:t>
-      </w:r>
-      <w:proofErr w:type="spellStart"/>
-      <w:r>
-        <w:rPr>
-          <w:lang w:val="it-IT"/>
-        </w:rPr>
-        <w:t>speedup</w:t>
-      </w:r>
-      <w:proofErr w:type="spellEnd"/>
-      <w:r>
-        <w:rPr>
-          <w:lang w:val="it-IT"/>
-        </w:rPr>
-        <w:t xml:space="preserve"> appare identico al caso in cui i processi </w:t>
+        <w:t xml:space="preserve">, il grafico di speedup appare identico al caso in cui i processi </w:t>
       </w:r>
       <w:r>
         <w:rPr>
@@ -30300,7 +29606,6 @@
                 <w14:ligatures w14:val="none"/>
               </w:rPr>
             </w:pPr>
-            <w:proofErr w:type="spellStart"/>
             <w:r>
               <w:rPr>
                 <w:rFonts w:ascii="Calibri" w:hAnsi="Calibri" w:cs="Calibri"/>
@@ -30309,60 +29614,76 @@
                 <w:sz w:val="22"/>
                 <w:szCs w:val="22"/>
               </w:rPr>
-              <w:t>sequentialT</w:t>
-            </w:r>
-            <w:proofErr w:type="spellEnd"/>
-            <w:r>
-              <w:rPr>
-                <w:rFonts w:ascii="Calibri" w:hAnsi="Calibri" w:cs="Calibri"/>
+              <w:t>sequentialT(s)</w:t>
+            </w:r>
+          </w:p>
+        </w:tc>
+        <w:tc>
+          <w:tcPr>
+            <w:tcW w:w="726" w:type="pct"/>
+            <w:tcBorders>
+              <w:top w:val="nil"/>
+              <w:left w:val="nil"/>
+              <w:bottom w:val="single" w:sz="4" w:space="0" w:color="auto"/>
+              <w:right w:val="single" w:sz="4" w:space="0" w:color="auto"/>
+            </w:tcBorders>
+            <w:shd w:val="clear" w:color="000000" w:fill="E2EFDA"/>
+            <w:noWrap/>
+            <w:vAlign w:val="bottom"/>
+            <w:hideMark/>
+          </w:tcPr>
+          <w:p>
+            <w:pPr>
+              <w:spacing w:after="0" w:line="240" w:lineRule="auto"/>
+              <w:rPr>
+                <w:rFonts w:ascii="Calibri" w:eastAsia="Times New Roman" w:hAnsi="Calibri" w:cs="Calibri"/>
                 <w:b/>
                 <w:bCs/>
-                <w:sz w:val="22"/>
-                <w:szCs w:val="22"/>
-              </w:rPr>
-              <w:t>(s)</w:t>
-            </w:r>
-          </w:p>
-        </w:tc>
-        <w:tc>
-          <w:tcPr>
-            <w:tcW w:w="726" w:type="pct"/>
-            <w:tcBorders>
-              <w:top w:val="nil"/>
-              <w:left w:val="nil"/>
-              <w:bottom w:val="single" w:sz="4" w:space="0" w:color="auto"/>
-              <w:right w:val="single" w:sz="4" w:space="0" w:color="auto"/>
-            </w:tcBorders>
-            <w:shd w:val="clear" w:color="000000" w:fill="E2EFDA"/>
-            <w:noWrap/>
-            <w:vAlign w:val="bottom"/>
-            <w:hideMark/>
-          </w:tcPr>
-          <w:p>
-            <w:pPr>
-              <w:spacing w:after="0" w:line="240" w:lineRule="auto"/>
-              <w:rPr>
-                <w:rFonts w:ascii="Calibri" w:eastAsia="Times New Roman" w:hAnsi="Calibri" w:cs="Calibri"/>
+                <w:kern w:val="0"/>
+                <w:sz w:val="22"/>
+                <w:szCs w:val="22"/>
+                <w14:ligatures w14:val="none"/>
+              </w:rPr>
+            </w:pPr>
+            <w:r>
+              <w:rPr>
+                <w:rFonts w:ascii="Calibri" w:hAnsi="Calibri" w:cs="Calibri"/>
                 <w:b/>
                 <w:bCs/>
-                <w:kern w:val="0"/>
-                <w:sz w:val="22"/>
-                <w:szCs w:val="22"/>
-                <w14:ligatures w14:val="none"/>
-              </w:rPr>
-            </w:pPr>
-            <w:proofErr w:type="spellStart"/>
-            <w:r>
-              <w:rPr>
-                <w:rFonts w:ascii="Calibri" w:hAnsi="Calibri" w:cs="Calibri"/>
+                <w:sz w:val="22"/>
+                <w:szCs w:val="22"/>
+              </w:rPr>
+              <w:t>parallelT(s)</w:t>
+            </w:r>
+          </w:p>
+        </w:tc>
+        <w:tc>
+          <w:tcPr>
+            <w:tcW w:w="676" w:type="pct"/>
+            <w:tcBorders>
+              <w:top w:val="nil"/>
+              <w:left w:val="nil"/>
+              <w:bottom w:val="single" w:sz="4" w:space="0" w:color="auto"/>
+              <w:right w:val="single" w:sz="4" w:space="0" w:color="auto"/>
+            </w:tcBorders>
+            <w:shd w:val="clear" w:color="000000" w:fill="E2EFDA"/>
+            <w:noWrap/>
+            <w:vAlign w:val="bottom"/>
+            <w:hideMark/>
+          </w:tcPr>
+          <w:p>
+            <w:pPr>
+              <w:spacing w:after="0" w:line="240" w:lineRule="auto"/>
+              <w:rPr>
+                <w:rFonts w:ascii="Calibri" w:eastAsia="Times New Roman" w:hAnsi="Calibri" w:cs="Calibri"/>
                 <w:b/>
                 <w:bCs/>
-                <w:sz w:val="22"/>
-                <w:szCs w:val="22"/>
-              </w:rPr>
-              <w:t>parallelT</w:t>
-            </w:r>
-            <w:proofErr w:type="spellEnd"/>
+                <w:kern w:val="0"/>
+                <w:sz w:val="22"/>
+                <w:szCs w:val="22"/>
+                <w14:ligatures w14:val="none"/>
+              </w:rPr>
+            </w:pPr>
             <w:r>
               <w:rPr>
                 <w:rFonts w:ascii="Calibri" w:hAnsi="Calibri" w:cs="Calibri"/>
@@ -30371,13 +29692,13 @@
                 <w:sz w:val="22"/>
                 <w:szCs w:val="22"/>
               </w:rPr>
-              <w:t>(s)</w:t>
-            </w:r>
-          </w:p>
-        </w:tc>
-        <w:tc>
-          <w:tcPr>
-            <w:tcW w:w="676" w:type="pct"/>
+              <w:t>totalT(s)</w:t>
+            </w:r>
+          </w:p>
+        </w:tc>
+        <w:tc>
+          <w:tcPr>
+            <w:tcW w:w="403" w:type="pct"/>
             <w:tcBorders>
               <w:top w:val="nil"/>
               <w:left w:val="nil"/>
@@ -30402,7 +29723,6 @@
                 <w14:ligatures w14:val="none"/>
               </w:rPr>
             </w:pPr>
-            <w:proofErr w:type="spellStart"/>
             <w:r>
               <w:rPr>
                 <w:rFonts w:ascii="Calibri" w:hAnsi="Calibri" w:cs="Calibri"/>
@@ -30411,87 +29731,86 @@
                 <w:sz w:val="22"/>
                 <w:szCs w:val="22"/>
               </w:rPr>
-              <w:t>totalT</w:t>
-            </w:r>
-            <w:proofErr w:type="spellEnd"/>
-            <w:r>
-              <w:rPr>
-                <w:rFonts w:ascii="Calibri" w:hAnsi="Calibri" w:cs="Calibri"/>
+              <w:t>nodes</w:t>
+            </w:r>
+          </w:p>
+        </w:tc>
+        <w:tc>
+          <w:tcPr>
+            <w:tcW w:w="829" w:type="pct"/>
+            <w:tcBorders>
+              <w:top w:val="nil"/>
+              <w:left w:val="nil"/>
+              <w:bottom w:val="single" w:sz="4" w:space="0" w:color="auto"/>
+              <w:right w:val="single" w:sz="4" w:space="0" w:color="auto"/>
+            </w:tcBorders>
+            <w:shd w:val="clear" w:color="000000" w:fill="E2EFDA"/>
+            <w:noWrap/>
+            <w:vAlign w:val="bottom"/>
+            <w:hideMark/>
+          </w:tcPr>
+          <w:p>
+            <w:pPr>
+              <w:spacing w:after="0" w:line="240" w:lineRule="auto"/>
+              <w:rPr>
+                <w:rFonts w:ascii="Calibri" w:eastAsia="Times New Roman" w:hAnsi="Calibri" w:cs="Calibri"/>
                 <w:b/>
                 <w:bCs/>
-                <w:sz w:val="22"/>
-                <w:szCs w:val="22"/>
-              </w:rPr>
-              <w:t>(s)</w:t>
-            </w:r>
-          </w:p>
-        </w:tc>
-        <w:tc>
-          <w:tcPr>
-            <w:tcW w:w="403" w:type="pct"/>
-            <w:tcBorders>
-              <w:top w:val="nil"/>
-              <w:left w:val="nil"/>
-              <w:bottom w:val="single" w:sz="4" w:space="0" w:color="auto"/>
-              <w:right w:val="single" w:sz="4" w:space="0" w:color="auto"/>
-            </w:tcBorders>
-            <w:shd w:val="clear" w:color="000000" w:fill="E2EFDA"/>
-            <w:noWrap/>
-            <w:vAlign w:val="bottom"/>
-            <w:hideMark/>
-          </w:tcPr>
-          <w:p>
-            <w:pPr>
-              <w:spacing w:after="0" w:line="240" w:lineRule="auto"/>
-              <w:rPr>
-                <w:rFonts w:ascii="Calibri" w:eastAsia="Times New Roman" w:hAnsi="Calibri" w:cs="Calibri"/>
+                <w:kern w:val="0"/>
+                <w:sz w:val="22"/>
+                <w:szCs w:val="22"/>
+                <w14:ligatures w14:val="none"/>
+              </w:rPr>
+            </w:pPr>
+            <w:r>
+              <w:rPr>
+                <w:rFonts w:ascii="Calibri" w:hAnsi="Calibri" w:cs="Calibri"/>
                 <w:b/>
                 <w:bCs/>
-                <w:kern w:val="0"/>
-                <w:sz w:val="22"/>
-                <w:szCs w:val="22"/>
-                <w14:ligatures w14:val="none"/>
-              </w:rPr>
-            </w:pPr>
-            <w:r>
-              <w:rPr>
-                <w:rFonts w:ascii="Calibri" w:hAnsi="Calibri" w:cs="Calibri"/>
+                <w:sz w:val="22"/>
+                <w:szCs w:val="22"/>
+              </w:rPr>
+              <w:t>Speedup</w:t>
+            </w:r>
+          </w:p>
+        </w:tc>
+        <w:tc>
+          <w:tcPr>
+            <w:tcW w:w="829" w:type="pct"/>
+            <w:tcBorders>
+              <w:top w:val="nil"/>
+              <w:left w:val="nil"/>
+              <w:bottom w:val="single" w:sz="4" w:space="0" w:color="auto"/>
+              <w:right w:val="single" w:sz="4" w:space="0" w:color="auto"/>
+            </w:tcBorders>
+            <w:shd w:val="clear" w:color="000000" w:fill="E2EFDA"/>
+            <w:noWrap/>
+            <w:vAlign w:val="bottom"/>
+            <w:hideMark/>
+          </w:tcPr>
+          <w:p>
+            <w:pPr>
+              <w:spacing w:after="0" w:line="240" w:lineRule="auto"/>
+              <w:rPr>
+                <w:rFonts w:ascii="Calibri" w:eastAsia="Times New Roman" w:hAnsi="Calibri" w:cs="Calibri"/>
                 <w:b/>
                 <w:bCs/>
-                <w:sz w:val="22"/>
-                <w:szCs w:val="22"/>
-              </w:rPr>
-              <w:t>nodes</w:t>
-            </w:r>
-          </w:p>
-        </w:tc>
-        <w:tc>
-          <w:tcPr>
-            <w:tcW w:w="829" w:type="pct"/>
-            <w:tcBorders>
-              <w:top w:val="nil"/>
-              <w:left w:val="nil"/>
-              <w:bottom w:val="single" w:sz="4" w:space="0" w:color="auto"/>
-              <w:right w:val="single" w:sz="4" w:space="0" w:color="auto"/>
-            </w:tcBorders>
-            <w:shd w:val="clear" w:color="000000" w:fill="E2EFDA"/>
-            <w:noWrap/>
-            <w:vAlign w:val="bottom"/>
-            <w:hideMark/>
-          </w:tcPr>
-          <w:p>
-            <w:pPr>
-              <w:spacing w:after="0" w:line="240" w:lineRule="auto"/>
-              <w:rPr>
-                <w:rFonts w:ascii="Calibri" w:eastAsia="Times New Roman" w:hAnsi="Calibri" w:cs="Calibri"/>
+                <w:kern w:val="0"/>
+                <w:sz w:val="22"/>
+                <w:szCs w:val="22"/>
+                <w14:ligatures w14:val="none"/>
+              </w:rPr>
+            </w:pPr>
+            <w:r>
+              <w:rPr>
+                <w:rFonts w:ascii="Calibri" w:hAnsi="Calibri" w:cs="Calibri"/>
                 <w:b/>
                 <w:bCs/>
-                <w:kern w:val="0"/>
-                <w:sz w:val="22"/>
-                <w:szCs w:val="22"/>
-                <w14:ligatures w14:val="none"/>
-              </w:rPr>
-            </w:pPr>
+                <w:sz w:val="22"/>
+                <w:szCs w:val="22"/>
+              </w:rPr>
+              <w:t>Effic</w:t>
+            </w:r>
             <w:r>
               <w:rPr>
                 <w:rFonts w:ascii="Calibri" w:hAnsi="Calibri" w:cs="Calibri"/>
@@ -30500,69 +29819,18 @@
                 <w:sz w:val="22"/>
                 <w:szCs w:val="22"/>
               </w:rPr>
-              <w:t>Speedup</w:t>
-            </w:r>
-          </w:p>
-        </w:tc>
-        <w:tc>
-          <w:tcPr>
-            <w:tcW w:w="829" w:type="pct"/>
-            <w:tcBorders>
-              <w:top w:val="nil"/>
-              <w:left w:val="nil"/>
-              <w:bottom w:val="single" w:sz="4" w:space="0" w:color="auto"/>
-              <w:right w:val="single" w:sz="4" w:space="0" w:color="auto"/>
-            </w:tcBorders>
-            <w:shd w:val="clear" w:color="000000" w:fill="E2EFDA"/>
-            <w:noWrap/>
-            <w:vAlign w:val="bottom"/>
-            <w:hideMark/>
-          </w:tcPr>
-          <w:p>
-            <w:pPr>
-              <w:spacing w:after="0" w:line="240" w:lineRule="auto"/>
-              <w:rPr>
-                <w:rFonts w:ascii="Calibri" w:eastAsia="Times New Roman" w:hAnsi="Calibri" w:cs="Calibri"/>
+              <w:t>i</w:t>
+            </w:r>
+            <w:r>
+              <w:rPr>
+                <w:rFonts w:ascii="Calibri" w:hAnsi="Calibri" w:cs="Calibri"/>
                 <w:b/>
                 <w:bCs/>
-                <w:kern w:val="0"/>
-                <w:sz w:val="22"/>
-                <w:szCs w:val="22"/>
-                <w14:ligatures w14:val="none"/>
-              </w:rPr>
-            </w:pPr>
-            <w:proofErr w:type="spellStart"/>
-            <w:r>
-              <w:rPr>
-                <w:rFonts w:ascii="Calibri" w:hAnsi="Calibri" w:cs="Calibri"/>
-                <w:b/>
-                <w:bCs/>
-                <w:sz w:val="22"/>
-                <w:szCs w:val="22"/>
-              </w:rPr>
-              <w:t>Effic</w:t>
-            </w:r>
-            <w:r>
-              <w:rPr>
-                <w:rFonts w:ascii="Calibri" w:hAnsi="Calibri" w:cs="Calibri"/>
-                <w:b/>
-                <w:bCs/>
-                <w:sz w:val="22"/>
-                <w:szCs w:val="22"/>
-              </w:rPr>
-              <w:t>i</w:t>
-            </w:r>
-            <w:r>
-              <w:rPr>
-                <w:rFonts w:ascii="Calibri" w:hAnsi="Calibri" w:cs="Calibri"/>
-                <w:b/>
-                <w:bCs/>
                 <w:sz w:val="22"/>
                 <w:szCs w:val="22"/>
               </w:rPr>
               <w:t>enza</w:t>
             </w:r>
-            <w:proofErr w:type="spellEnd"/>
           </w:p>
         </w:tc>
       </w:tr>
@@ -34450,6 +33718,7 @@
         <w:rPr>
           <w:noProof/>
         </w:rPr>
+        <w:lastRenderedPageBreak/>
         <w:drawing>
           <wp:inline distT="0" distB="0" distL="0" distR="0" wp14:anchorId="3F404F30" wp14:editId="6EA2DC9C">
             <wp:extent cx="6858000" cy="3270885"/>
@@ -36725,8 +35994,7 @@
             <a:ln w="28575" cap="rnd">
               <a:solidFill>
                 <a:schemeClr val="accent1">
-                  <a:lumMod val="80000"/>
-                  <a:lumOff val="20000"/>
+                  <a:lumMod val="75000"/>
                 </a:schemeClr>
               </a:solidFill>
               <a:round/>
@@ -36847,7 +36115,7 @@
           <c:smooth val="1"/>
           <c:extLst>
             <c:ext xmlns:c16="http://schemas.microsoft.com/office/drawing/2014/chart" uri="{C3380CC4-5D6E-409C-BE32-E72D297353CC}">
-              <c16:uniqueId val="{00000000-CA4B-42B4-90E2-B2462135D3F1}"/>
+              <c16:uniqueId val="{00000000-A36A-444D-AC53-3FC5C88A9913}"/>
             </c:ext>
           </c:extLst>
         </c:ser>
@@ -36868,9 +36136,8 @@
           <c:spPr>
             <a:ln w="28575" cap="rnd">
               <a:solidFill>
-                <a:schemeClr val="accent2">
-                  <a:lumMod val="80000"/>
-                  <a:lumOff val="20000"/>
+                <a:schemeClr val="bg1">
+                  <a:lumMod val="65000"/>
                 </a:schemeClr>
               </a:solidFill>
               <a:round/>
@@ -36991,7 +36258,7 @@
           <c:smooth val="1"/>
           <c:extLst>
             <c:ext xmlns:c16="http://schemas.microsoft.com/office/drawing/2014/chart" uri="{C3380CC4-5D6E-409C-BE32-E72D297353CC}">
-              <c16:uniqueId val="{00000001-CA4B-42B4-90E2-B2462135D3F1}"/>
+              <c16:uniqueId val="{00000001-A36A-444D-AC53-3FC5C88A9913}"/>
             </c:ext>
           </c:extLst>
         </c:ser>
@@ -37026,8 +36293,150 @@
           <c:spPr>
             <a:ln w="28575" cap="rnd">
               <a:solidFill>
-                <a:schemeClr val="accent6">
+                <a:schemeClr val="accent6"/>
+              </a:solidFill>
+              <a:round/>
+            </a:ln>
+            <a:effectLst/>
+          </c:spPr>
+          <c:marker>
+            <c:symbol val="circle"/>
+            <c:size val="5"/>
+            <c:spPr>
+              <a:solidFill>
+                <a:srgbClr val="FF0000"/>
+              </a:solidFill>
+              <a:ln w="9525">
+                <a:solidFill>
+                  <a:srgbClr val="FF0000"/>
+                </a:solidFill>
+              </a:ln>
+              <a:effectLst/>
+            </c:spPr>
+          </c:marker>
+          <c:xVal>
+            <c:numRef>
+              <c:f>Sintesi!$A$21:$A$33</c:f>
+              <c:numCache>
+                <c:formatCode>General</c:formatCode>
+                <c:ptCount val="13"/>
+                <c:pt idx="0">
+                  <c:v>1</c:v>
+                </c:pt>
+                <c:pt idx="1">
+                  <c:v>4</c:v>
+                </c:pt>
+                <c:pt idx="2">
+                  <c:v>8</c:v>
+                </c:pt>
+                <c:pt idx="3">
+                  <c:v>12</c:v>
+                </c:pt>
+                <c:pt idx="4">
+                  <c:v>16</c:v>
+                </c:pt>
+                <c:pt idx="5">
+                  <c:v>20</c:v>
+                </c:pt>
+                <c:pt idx="6">
+                  <c:v>24</c:v>
+                </c:pt>
+                <c:pt idx="7">
+                  <c:v>28</c:v>
+                </c:pt>
+                <c:pt idx="8">
+                  <c:v>32</c:v>
+                </c:pt>
+                <c:pt idx="9">
+                  <c:v>36</c:v>
+                </c:pt>
+                <c:pt idx="10">
+                  <c:v>40</c:v>
+                </c:pt>
+                <c:pt idx="11">
+                  <c:v>44</c:v>
+                </c:pt>
+                <c:pt idx="12">
+                  <c:v>48</c:v>
+                </c:pt>
+              </c:numCache>
+            </c:numRef>
+          </c:xVal>
+          <c:yVal>
+            <c:numRef>
+              <c:f>Sintesi!$G$21:$G$33</c:f>
+              <c:numCache>
+                <c:formatCode>General</c:formatCode>
+                <c:ptCount val="13"/>
+                <c:pt idx="0">
+                  <c:v>1</c:v>
+                </c:pt>
+                <c:pt idx="1">
+                  <c:v>2.3921270632201805</c:v>
+                </c:pt>
+                <c:pt idx="2">
+                  <c:v>2.0874764241959767</c:v>
+                </c:pt>
+                <c:pt idx="3">
+                  <c:v>2.3173502389418976</c:v>
+                </c:pt>
+                <c:pt idx="4">
+                  <c:v>2.3782471654065036</c:v>
+                </c:pt>
+                <c:pt idx="5">
+                  <c:v>2.4072045148560526</c:v>
+                </c:pt>
+                <c:pt idx="6">
+                  <c:v>2.4279067415162094</c:v>
+                </c:pt>
+                <c:pt idx="7">
+                  <c:v>2.4812612715717348</c:v>
+                </c:pt>
+                <c:pt idx="8">
+                  <c:v>2.4781323800797534</c:v>
+                </c:pt>
+                <c:pt idx="9">
+                  <c:v>2.3751470507393768</c:v>
+                </c:pt>
+                <c:pt idx="10">
+                  <c:v>2.2678481377422375</c:v>
+                </c:pt>
+                <c:pt idx="11">
+                  <c:v>1.4153063972973734</c:v>
+                </c:pt>
+                <c:pt idx="12">
+                  <c:v>2.2842098272124316</c:v>
+                </c:pt>
+              </c:numCache>
+            </c:numRef>
+          </c:yVal>
+          <c:smooth val="1"/>
+          <c:extLst>
+            <c:ext xmlns:c16="http://schemas.microsoft.com/office/drawing/2014/chart" uri="{C3380CC4-5D6E-409C-BE32-E72D297353CC}">
+              <c16:uniqueId val="{00000002-A36A-444D-AC53-3FC5C88A9913}"/>
+            </c:ext>
+          </c:extLst>
+        </c:ser>
+        <c:ser>
+          <c:idx val="6"/>
+          <c:order val="2"/>
+          <c:tx>
+            <c:strRef>
+              <c:f>Sintesi!$O$20</c:f>
+              <c:strCache>
+                <c:ptCount val="1"/>
+                <c:pt idx="0">
+                  <c:v>Speedup OMP</c:v>
+                </c:pt>
+              </c:strCache>
+            </c:strRef>
+          </c:tx>
+          <c:spPr>
+            <a:ln w="28575" cap="rnd">
+              <a:solidFill>
+                <a:schemeClr val="accent2">
                   <a:lumMod val="60000"/>
+                  <a:lumOff val="40000"/>
                 </a:schemeClr>
               </a:solidFill>
               <a:round/>
@@ -37099,7 +36508,7 @@
           </c:xVal>
           <c:yVal>
             <c:numRef>
-              <c:f>Sintesi!$G$21:$G$33</c:f>
+              <c:f>Sintesi!$O$21:$O$33</c:f>
               <c:numCache>
                 <c:formatCode>General</c:formatCode>
                 <c:ptCount val="13"/>
@@ -37107,40 +36516,40 @@
                   <c:v>1</c:v>
                 </c:pt>
                 <c:pt idx="1">
-                  <c:v>2.3921270632201805</c:v>
+                  <c:v>3.9299339575938235</c:v>
                 </c:pt>
                 <c:pt idx="2">
-                  <c:v>2.0874764241959767</c:v>
+                  <c:v>7.9630345004215171</c:v>
                 </c:pt>
                 <c:pt idx="3">
-                  <c:v>2.3173502389418976</c:v>
+                  <c:v>11.778202193986266</c:v>
                 </c:pt>
                 <c:pt idx="4">
-                  <c:v>2.3782471654065036</c:v>
+                  <c:v>15.84936678614098</c:v>
                 </c:pt>
                 <c:pt idx="5">
-                  <c:v>2.4072045148560526</c:v>
+                  <c:v>19.822655282885545</c:v>
                 </c:pt>
                 <c:pt idx="6">
-                  <c:v>2.4279067415162094</c:v>
+                  <c:v>23.438511996063259</c:v>
                 </c:pt>
                 <c:pt idx="7">
-                  <c:v>2.4812612715717348</c:v>
+                  <c:v>27.26343479894776</c:v>
                 </c:pt>
                 <c:pt idx="8">
-                  <c:v>2.4781323800797534</c:v>
+                  <c:v>31.202019621268747</c:v>
                 </c:pt>
                 <c:pt idx="9">
-                  <c:v>2.3751470507393768</c:v>
+                  <c:v>35.017164786118009</c:v>
                 </c:pt>
                 <c:pt idx="10">
-                  <c:v>2.2678481377422375</c:v>
+                  <c:v>38.8538699851605</c:v>
                 </c:pt>
                 <c:pt idx="11">
-                  <c:v>1.4153063972973734</c:v>
+                  <c:v>42.599296264388691</c:v>
                 </c:pt>
                 <c:pt idx="12">
-                  <c:v>2.2842098272124316</c:v>
+                  <c:v>45.822268163628728</c:v>
                 </c:pt>
               </c:numCache>
             </c:numRef>
@@ -37148,150 +36557,7 @@
           <c:smooth val="1"/>
           <c:extLst>
             <c:ext xmlns:c16="http://schemas.microsoft.com/office/drawing/2014/chart" uri="{C3380CC4-5D6E-409C-BE32-E72D297353CC}">
-              <c16:uniqueId val="{00000002-CA4B-42B4-90E2-B2462135D3F1}"/>
-            </c:ext>
-          </c:extLst>
-        </c:ser>
-        <c:ser>
-          <c:idx val="6"/>
-          <c:order val="2"/>
-          <c:tx>
-            <c:strRef>
-              <c:f>Sintesi!$O$20</c:f>
-              <c:strCache>
-                <c:ptCount val="1"/>
-                <c:pt idx="0">
-                  <c:v>Speedup OMP</c:v>
-                </c:pt>
-              </c:strCache>
-            </c:strRef>
-          </c:tx>
-          <c:spPr>
-            <a:ln w="28575" cap="rnd">
-              <a:solidFill>
-                <a:schemeClr val="accent1">
-                  <a:lumMod val="60000"/>
-                </a:schemeClr>
-              </a:solidFill>
-              <a:round/>
-            </a:ln>
-            <a:effectLst/>
-          </c:spPr>
-          <c:marker>
-            <c:symbol val="circle"/>
-            <c:size val="5"/>
-            <c:spPr>
-              <a:solidFill>
-                <a:srgbClr val="FF0000"/>
-              </a:solidFill>
-              <a:ln w="9525">
-                <a:solidFill>
-                  <a:srgbClr val="FF0000"/>
-                </a:solidFill>
-              </a:ln>
-              <a:effectLst/>
-            </c:spPr>
-          </c:marker>
-          <c:xVal>
-            <c:numRef>
-              <c:f>Sintesi!$A$21:$A$33</c:f>
-              <c:numCache>
-                <c:formatCode>General</c:formatCode>
-                <c:ptCount val="13"/>
-                <c:pt idx="0">
-                  <c:v>1</c:v>
-                </c:pt>
-                <c:pt idx="1">
-                  <c:v>4</c:v>
-                </c:pt>
-                <c:pt idx="2">
-                  <c:v>8</c:v>
-                </c:pt>
-                <c:pt idx="3">
-                  <c:v>12</c:v>
-                </c:pt>
-                <c:pt idx="4">
-                  <c:v>16</c:v>
-                </c:pt>
-                <c:pt idx="5">
-                  <c:v>20</c:v>
-                </c:pt>
-                <c:pt idx="6">
-                  <c:v>24</c:v>
-                </c:pt>
-                <c:pt idx="7">
-                  <c:v>28</c:v>
-                </c:pt>
-                <c:pt idx="8">
-                  <c:v>32</c:v>
-                </c:pt>
-                <c:pt idx="9">
-                  <c:v>36</c:v>
-                </c:pt>
-                <c:pt idx="10">
-                  <c:v>40</c:v>
-                </c:pt>
-                <c:pt idx="11">
-                  <c:v>44</c:v>
-                </c:pt>
-                <c:pt idx="12">
-                  <c:v>48</c:v>
-                </c:pt>
-              </c:numCache>
-            </c:numRef>
-          </c:xVal>
-          <c:yVal>
-            <c:numRef>
-              <c:f>Sintesi!$O$21:$O$33</c:f>
-              <c:numCache>
-                <c:formatCode>General</c:formatCode>
-                <c:ptCount val="13"/>
-                <c:pt idx="0">
-                  <c:v>1</c:v>
-                </c:pt>
-                <c:pt idx="1">
-                  <c:v>3.9299339575938235</c:v>
-                </c:pt>
-                <c:pt idx="2">
-                  <c:v>7.9630345004215171</c:v>
-                </c:pt>
-                <c:pt idx="3">
-                  <c:v>11.778202193986266</c:v>
-                </c:pt>
-                <c:pt idx="4">
-                  <c:v>15.84936678614098</c:v>
-                </c:pt>
-                <c:pt idx="5">
-                  <c:v>19.822655282885545</c:v>
-                </c:pt>
-                <c:pt idx="6">
-                  <c:v>23.438511996063259</c:v>
-                </c:pt>
-                <c:pt idx="7">
-                  <c:v>27.26343479894776</c:v>
-                </c:pt>
-                <c:pt idx="8">
-                  <c:v>31.202019621268747</c:v>
-                </c:pt>
-                <c:pt idx="9">
-                  <c:v>35.017164786118009</c:v>
-                </c:pt>
-                <c:pt idx="10">
-                  <c:v>38.8538699851605</c:v>
-                </c:pt>
-                <c:pt idx="11">
-                  <c:v>42.599296264388691</c:v>
-                </c:pt>
-                <c:pt idx="12">
-                  <c:v>45.822268163628728</c:v>
-                </c:pt>
-              </c:numCache>
-            </c:numRef>
-          </c:yVal>
-          <c:smooth val="1"/>
-          <c:extLst>
-            <c:ext xmlns:c16="http://schemas.microsoft.com/office/drawing/2014/chart" uri="{C3380CC4-5D6E-409C-BE32-E72D297353CC}">
-              <c16:uniqueId val="{00000003-CA4B-42B4-90E2-B2462135D3F1}"/>
+              <c16:uniqueId val="{00000003-A36A-444D-AC53-3FC5C88A9913}"/>
             </c:ext>
           </c:extLst>
         </c:ser>
@@ -37335,8 +36601,15 @@
                   </a:defRPr>
                 </a:pPr>
                 <a:r>
-                  <a:rPr lang="en-US"/>
-                  <a:t>Number of tasks</a:t>
+                  <a:rPr lang="en-US" sz="1000" b="0" i="0" u="none" strike="noStrike" kern="1200" baseline="0">
+                    <a:solidFill>
+                      <a:sysClr val="windowText" lastClr="000000">
+                        <a:lumMod val="65000"/>
+                        <a:lumOff val="35000"/>
+                      </a:sysClr>
+                    </a:solidFill>
+                  </a:rPr>
+                  <a:t>Number of tasks/threads</a:t>
                 </a:r>
               </a:p>
             </c:rich>
@@ -42849,7 +42122,7 @@
           <c:smooth val="1"/>
           <c:extLst>
             <c:ext xmlns:c16="http://schemas.microsoft.com/office/drawing/2014/chart" uri="{C3380CC4-5D6E-409C-BE32-E72D297353CC}">
-              <c16:uniqueId val="{00000000-DF70-43A0-A31C-F5E6FF929EFD}"/>
+              <c16:uniqueId val="{00000000-D54F-4581-A650-3D1E3D828E22}"/>
             </c:ext>
           </c:extLst>
         </c:ser>
@@ -42870,9 +42143,8 @@
           <c:spPr>
             <a:ln w="28575" cap="rnd">
               <a:solidFill>
-                <a:schemeClr val="accent3">
-                  <a:lumMod val="80000"/>
-                  <a:lumOff val="20000"/>
+                <a:schemeClr val="bg1">
+                  <a:lumMod val="65000"/>
                 </a:schemeClr>
               </a:solidFill>
               <a:round/>
@@ -42896,50 +42168,47 @@
           </c:marker>
           <c:xVal>
             <c:numRef>
-              <c:f>Sintesi!$A$3:$A$16</c:f>
+              <c:f>Sintesi!$I$3:$I$15</c:f>
               <c:numCache>
                 <c:formatCode>General</c:formatCode>
-                <c:ptCount val="14"/>
+                <c:ptCount val="13"/>
                 <c:pt idx="0">
                   <c:v>1</c:v>
                 </c:pt>
                 <c:pt idx="1">
-                  <c:v>2</c:v>
+                  <c:v>4</c:v>
                 </c:pt>
                 <c:pt idx="2">
-                  <c:v>4</c:v>
+                  <c:v>8</c:v>
                 </c:pt>
                 <c:pt idx="3">
-                  <c:v>8</c:v>
+                  <c:v>12</c:v>
                 </c:pt>
                 <c:pt idx="4">
-                  <c:v>12</c:v>
+                  <c:v>16</c:v>
                 </c:pt>
                 <c:pt idx="5">
-                  <c:v>16</c:v>
+                  <c:v>20</c:v>
                 </c:pt>
                 <c:pt idx="6">
-                  <c:v>20</c:v>
+                  <c:v>24</c:v>
                 </c:pt>
                 <c:pt idx="7">
-                  <c:v>24</c:v>
+                  <c:v>28</c:v>
                 </c:pt>
                 <c:pt idx="8">
-                  <c:v>28</c:v>
+                  <c:v>32</c:v>
                 </c:pt>
                 <c:pt idx="9">
-                  <c:v>32</c:v>
+                  <c:v>36</c:v>
                 </c:pt>
                 <c:pt idx="10">
-                  <c:v>36</c:v>
+                  <c:v>40</c:v>
                 </c:pt>
                 <c:pt idx="11">
-                  <c:v>40</c:v>
+                  <c:v>44</c:v>
                 </c:pt>
                 <c:pt idx="12">
-                  <c:v>44</c:v>
-                </c:pt>
-                <c:pt idx="13">
                   <c:v>48</c:v>
                 </c:pt>
               </c:numCache>
@@ -42996,7 +42265,7 @@
           <c:smooth val="1"/>
           <c:extLst>
             <c:ext xmlns:c16="http://schemas.microsoft.com/office/drawing/2014/chart" uri="{C3380CC4-5D6E-409C-BE32-E72D297353CC}">
-              <c16:uniqueId val="{00000001-DF70-43A0-A31C-F5E6FF929EFD}"/>
+              <c16:uniqueId val="{00000001-D54F-4581-A650-3D1E3D828E22}"/>
             </c:ext>
           </c:extLst>
         </c:ser>
@@ -43157,7 +42426,7 @@
           <c:smooth val="1"/>
           <c:extLst>
             <c:ext xmlns:c16="http://schemas.microsoft.com/office/drawing/2014/chart" uri="{C3380CC4-5D6E-409C-BE32-E72D297353CC}">
-              <c16:uniqueId val="{00000002-DF70-43A0-A31C-F5E6FF929EFD}"/>
+              <c16:uniqueId val="{00000002-D54F-4581-A650-3D1E3D828E22}"/>
             </c:ext>
           </c:extLst>
         </c:ser>
@@ -43301,7 +42570,7 @@
           <c:smooth val="1"/>
           <c:extLst>
             <c:ext xmlns:c16="http://schemas.microsoft.com/office/drawing/2014/chart" uri="{C3380CC4-5D6E-409C-BE32-E72D297353CC}">
-              <c16:uniqueId val="{00000003-DF70-43A0-A31C-F5E6FF929EFD}"/>
+              <c16:uniqueId val="{00000003-D54F-4581-A650-3D1E3D828E22}"/>
             </c:ext>
           </c:extLst>
         </c:ser>
@@ -43346,7 +42615,7 @@
                 </a:pPr>
                 <a:r>
                   <a:rPr lang="en-US"/>
-                  <a:t>Number of tasks</a:t>
+                  <a:t>Number of tasks/threads</a:t>
                 </a:r>
               </a:p>
             </c:rich>
@@ -43544,7 +42813,7 @@
               <a:lstStyle/>
               <a:p>
                 <a:pPr>
-                  <a:defRPr sz="1400" b="0" i="0" u="none" strike="noStrike" kern="1200" baseline="0">
+                  <a:defRPr sz="1400" b="1" i="0" u="none" strike="noStrike" kern="1200" baseline="0">
                     <a:solidFill>
                       <a:srgbClr val="FF0000"/>
                     </a:solidFill>
@@ -43554,7 +42823,7 @@
                   </a:defRPr>
                 </a:pPr>
                 <a:r>
-                  <a:rPr lang="en-US" sz="1400">
+                  <a:rPr lang="en-US" sz="1400" b="1">
                     <a:solidFill>
                       <a:srgbClr val="FF0000"/>
                     </a:solidFill>
@@ -43577,7 +42846,7 @@
             <a:lstStyle/>
             <a:p>
               <a:pPr>
-                <a:defRPr sz="1400" b="0" i="0" u="none" strike="noStrike" kern="1200" baseline="0">
+                <a:defRPr sz="1400" b="1" i="0" u="none" strike="noStrike" kern="1200" baseline="0">
                   <a:solidFill>
                     <a:srgbClr val="FF0000"/>
                   </a:solidFill>

</xml_diff>